<commit_message>
Fix manager report signature placeholders
</commit_message>
<xml_diff>
--- a/assets/report-templates/manager-reports/academic-achievement-committee.docx
+++ b/assets/report-templates/manager-reports/academic-achievement-committee.docx
@@ -1939,6 +1939,8 @@
                               <w:rFonts w:ascii="Helvetica Neue W23 for SKY Reg" w:hAnsi="Helvetica Neue W23 for SKY Reg"/>
                               <w:color w:val="FFFFFF" w:themeColor="background1"/>
                             </w:rPr>
+                            <w:jc w:val="center"/>
+                            <w:bidi/>
                           </w:pPr>
                           <w:r>
                             <w:rPr>
@@ -1946,24 +1948,25 @@
                               <w:color w:val="FFFFFF" w:themeColor="background1"/>
                               <w:rtl/>
                             </w:rPr>
-                            <w:t>مدير المدرسة: {{</w:t>
+                            <w:t>{{signatureRightRole}}</w:t>
                           </w:r>
-                          <w:proofErr w:type="spellStart"/>
-                          <w:r>
+                        </w:p>
+                        <w:p>
+                          <w:pPr>
                             <w:rPr>
                               <w:rFonts w:ascii="Helvetica Neue W23 for SKY Reg" w:hAnsi="Helvetica Neue W23 for SKY Reg"/>
                               <w:color w:val="FFFFFF" w:themeColor="background1"/>
                             </w:rPr>
-                            <w:t>principalName</w:t>
-                          </w:r>
-                          <w:proofErr w:type="spellEnd"/>
+                            <w:jc w:val="center"/>
+                            <w:bidi/>
+                          </w:pPr>
                           <w:r>
                             <w:rPr>
                               <w:rFonts w:ascii="Helvetica Neue W23 for SKY Reg" w:hAnsi="Helvetica Neue W23 for SKY Reg"/>
                               <w:color w:val="FFFFFF" w:themeColor="background1"/>
                               <w:rtl/>
                             </w:rPr>
-                            <w:t>}}</w:t>
+                            <w:t>{{signatureRightName}}</w:t>
                           </w:r>
                         </w:p>
                       </w:txbxContent>
@@ -1998,6 +2001,8 @@
                         <w:rFonts w:ascii="Helvetica Neue W23 for SKY Reg" w:hAnsi="Helvetica Neue W23 for SKY Reg"/>
                         <w:color w:val="FFFFFF" w:themeColor="background1"/>
                       </w:rPr>
+                      <w:jc w:val="center"/>
+                      <w:bidi/>
                     </w:pPr>
                     <w:r>
                       <w:rPr>
@@ -2005,24 +2010,186 @@
                         <w:color w:val="FFFFFF" w:themeColor="background1"/>
                         <w:rtl/>
                       </w:rPr>
-                      <w:t>مدير المدرسة: {{</w:t>
+                      <w:t>{{signatureRightRole}}</w:t>
                     </w:r>
-                    <w:proofErr w:type="spellStart"/>
-                    <w:r>
+                  </w:p>
+                  <w:p>
+                    <w:pPr>
                       <w:rPr>
                         <w:rFonts w:ascii="Helvetica Neue W23 for SKY Reg" w:hAnsi="Helvetica Neue W23 for SKY Reg"/>
                         <w:color w:val="FFFFFF" w:themeColor="background1"/>
                       </w:rPr>
-                      <w:t>principalName</w:t>
-                    </w:r>
-                    <w:proofErr w:type="spellEnd"/>
+                      <w:jc w:val="center"/>
+                      <w:bidi/>
+                    </w:pPr>
                     <w:r>
                       <w:rPr>
                         <w:rFonts w:ascii="Helvetica Neue W23 for SKY Reg" w:hAnsi="Helvetica Neue W23 for SKY Reg"/>
                         <w:color w:val="FFFFFF" w:themeColor="background1"/>
                         <w:rtl/>
                       </w:rPr>
-                      <w:t>}}</w:t>
+                      <w:t>{{signatureRightName}}</w:t>
+                    </w:r>
+                  </w:p>
+                </w:txbxContent>
+              </v:textbox>
+              <w10:wrap type="tight"/>
+            </v:shape>
+          </w:pict>
+        </mc:Fallback>
+      </mc:AlternateContent>
+    </w:r>
+    <w:r>
+      <w:rPr>
+        <w:noProof/>
+        <w:rtl/>
+      </w:rPr>
+      <mc:AlternateContent>
+        <mc:Choice Requires="wps">
+          <w:drawing>
+            <wp:anchor distT="45720" distB="45720" distL="114300" distR="114300" simplePos="0" relativeHeight="251666432" behindDoc="1" locked="0" layoutInCell="1" allowOverlap="1" wp14:anchorId="2E741FF7" wp14:editId="BB7C7598">
+              <wp:simplePos x="0" y="0"/>
+              <wp:positionH relativeFrom="column">
+                <wp:posOffset>0</wp:posOffset>
+              </wp:positionH>
+              <wp:positionV relativeFrom="paragraph">
+                <wp:posOffset>513715</wp:posOffset>
+              </wp:positionV>
+              <wp:extent cx="2360930" cy="499110"/>
+              <wp:effectExtent l="0" t="0" r="0" b="0"/>
+              <wp:wrapTight wrapText="bothSides">
+                <wp:wrapPolygon edited="0">
+                  <wp:start x="490" y="0"/>
+                  <wp:lineTo x="490" y="20611"/>
+                  <wp:lineTo x="21067" y="20611"/>
+                  <wp:lineTo x="21067" y="0"/>
+                  <wp:lineTo x="490" y="0"/>
+                </wp:wrapPolygon>
+              </wp:wrapTight>
+              <wp:docPr id="2131893608" name="Left Signature"/>
+              <wp:cNvGraphicFramePr>
+                <a:graphicFrameLocks xmlns:a="http://schemas.openxmlformats.org/drawingml/2006/main"/>
+              </wp:cNvGraphicFramePr>
+              <a:graphic xmlns:a="http://schemas.openxmlformats.org/drawingml/2006/main">
+                <a:graphicData uri="http://schemas.microsoft.com/office/word/2010/wordprocessingShape">
+                  <wps:wsp>
+                    <wps:cNvSpPr txBox="1">
+                      <a:spLocks noChangeArrowheads="1"/>
+                    </wps:cNvSpPr>
+                    <wps:spPr bwMode="auto">
+                      <a:xfrm flipH="1">
+                        <a:off x="0" y="0"/>
+                        <a:ext cx="2360930" cy="499110"/>
+                      </a:xfrm>
+                      <a:prstGeom prst="rect">
+                        <a:avLst/>
+                      </a:prstGeom>
+                      <a:noFill/>
+                      <a:ln w="9525">
+                        <a:noFill/>
+                        <a:miter lim="800000"/>
+                        <a:headEnd/>
+                        <a:tailEnd/>
+                      </a:ln>
+                    </wps:spPr>
+                    <wps:txbx>
+                      <w:txbxContent>
+                        <w:p>
+                          <w:pPr>
+                            <w:rPr>
+                              <w:rFonts w:ascii="Helvetica Neue W23 for SKY Reg" w:hAnsi="Helvetica Neue W23 for SKY Reg"/>
+                              <w:color w:val="FFFFFF" w:themeColor="background1"/>
+                            </w:rPr>
+                            <w:jc w:val="center"/>
+                            <w:bidi/>
+                          </w:pPr>
+                          <w:r>
+                            <w:rPr>
+                              <w:rFonts w:ascii="Helvetica Neue W23 for SKY Reg" w:hAnsi="Helvetica Neue W23 for SKY Reg"/>
+                              <w:color w:val="FFFFFF" w:themeColor="background1"/>
+                              <w:rtl/>
+                            </w:rPr>
+                            <w:t>{{signatureLeftRole}}</w:t>
+                          </w:r>
+                        </w:p>
+                        <w:p>
+                          <w:pPr>
+                            <w:rPr>
+                              <w:rFonts w:ascii="Helvetica Neue W23 for SKY Reg" w:hAnsi="Helvetica Neue W23 for SKY Reg"/>
+                              <w:color w:val="FFFFFF" w:themeColor="background1"/>
+                            </w:rPr>
+                            <w:jc w:val="center"/>
+                            <w:bidi/>
+                          </w:pPr>
+                          <w:r>
+                            <w:rPr>
+                              <w:rFonts w:ascii="Helvetica Neue W23 for SKY Reg" w:hAnsi="Helvetica Neue W23 for SKY Reg"/>
+                              <w:color w:val="FFFFFF" w:themeColor="background1"/>
+                              <w:rtl/>
+                            </w:rPr>
+                            <w:t>{{signatureLeftName}}</w:t>
+                          </w:r>
+                        </w:p>
+                      </w:txbxContent>
+                    </wps:txbx>
+                    <wps:bodyPr rot="0" vert="horz" wrap="square" lIns="91440" tIns="45720" rIns="91440" bIns="45720" anchor="t" anchorCtr="0">
+                      <a:noAutofit/>
+                    </wps:bodyPr>
+                  </wps:wsp>
+                </a:graphicData>
+              </a:graphic>
+              <wp14:sizeRelH relativeFrom="margin">
+                <wp14:pctWidth>40000</wp14:pctWidth>
+              </wp14:sizeRelH>
+              <wp14:sizeRelV relativeFrom="margin">
+                <wp14:pctHeight>0</wp14:pctHeight>
+              </wp14:sizeRelV>
+            </wp:anchor>
+          </w:drawing>
+        </mc:Choice>
+        <mc:Fallback>
+          <w:pict>
+            <v:shapetype w14:anchorId="B3E9F85E" id="_x0000_t202" coordsize="21600,21600" o:spt="202" path="m,l,21600r21600,l21600,xe">
+              <v:stroke joinstyle="miter"/>
+              <v:path gradientshapeok="t" o:connecttype="rect"/>
+            </v:shapetype>
+            <v:shape id="Left Signature" o:spid="_x0000_s1029" type="#_x0000_t202" style="position:absolute;left:0;text-align:left;margin-left:0pt;margin-top:40.45pt;width:185.9pt;height:39.3pt;flip:x;z-index:-251650048;visibility:visible;mso-wrap-style:square;mso-width-percent:400;mso-height-percent:0;mso-wrap-distance-left:9pt;mso-wrap-distance-top:3.6pt;mso-wrap-distance-right:9pt;mso-wrap-distance-bottom:3.6pt;mso-position-horizontal:absolute;mso-position-horizontal-relative:text;mso-position-vertical:absolute;mso-position-vertical-relative:text;mso-width-percent:400;mso-height-percent:0;mso-width-relative:margin;mso-height-relative:margin;v-text-anchor:top" o:gfxdata="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" filled="f" stroked="f">
+              <v:textbox>
+                <w:txbxContent>
+                  <w:p>
+                    <w:pPr>
+                      <w:rPr>
+                        <w:rFonts w:ascii="Helvetica Neue W23 for SKY Reg" w:hAnsi="Helvetica Neue W23 for SKY Reg"/>
+                        <w:color w:val="FFFFFF" w:themeColor="background1"/>
+                      </w:rPr>
+                      <w:jc w:val="center"/>
+                      <w:bidi/>
+                    </w:pPr>
+                    <w:r>
+                      <w:rPr>
+                        <w:rFonts w:ascii="Helvetica Neue W23 for SKY Reg" w:hAnsi="Helvetica Neue W23 for SKY Reg"/>
+                        <w:color w:val="FFFFFF" w:themeColor="background1"/>
+                        <w:rtl/>
+                      </w:rPr>
+                      <w:t>{{signatureLeftRole}}</w:t>
+                    </w:r>
+                  </w:p>
+                  <w:p>
+                    <w:pPr>
+                      <w:rPr>
+                        <w:rFonts w:ascii="Helvetica Neue W23 for SKY Reg" w:hAnsi="Helvetica Neue W23 for SKY Reg"/>
+                        <w:color w:val="FFFFFF" w:themeColor="background1"/>
+                      </w:rPr>
+                      <w:jc w:val="center"/>
+                      <w:bidi/>
+                    </w:pPr>
+                    <w:r>
+                      <w:rPr>
+                        <w:rFonts w:ascii="Helvetica Neue W23 for SKY Reg" w:hAnsi="Helvetica Neue W23 for SKY Reg"/>
+                        <w:color w:val="FFFFFF" w:themeColor="background1"/>
+                        <w:rtl/>
+                      </w:rPr>
+                      <w:t>{{signatureLeftName}}</w:t>
                     </w:r>
                   </w:p>
                 </w:txbxContent>

</xml_diff>

<commit_message>
Limit manager report signature choices
</commit_message>
<xml_diff>
--- a/assets/report-templates/manager-reports/academic-achievement-committee.docx
+++ b/assets/report-templates/manager-reports/academic-achievement-committee.docx
@@ -1627,7 +1627,6 @@
     <w:p>
       <w:pPr>
         <w:rPr>
-          <w:rFonts w:hint="cs"/>
           <w:rtl/>
         </w:rPr>
       </w:pPr>
@@ -1802,7 +1801,7 @@
       <mc:AlternateContent>
         <mc:Choice Requires="wps">
           <w:drawing>
-            <wp:anchor distT="0" distB="0" distL="114300" distR="114300" simplePos="0" relativeHeight="251663360" behindDoc="0" locked="0" layoutInCell="1" allowOverlap="1" wp14:anchorId="013D7D1B" wp14:editId="2EF537A5">
+            <wp:anchor distT="0" distB="0" distL="114300" distR="114300" simplePos="0" relativeHeight="251657216" behindDoc="0" locked="0" layoutInCell="1" allowOverlap="1" wp14:anchorId="013D7D1B" wp14:editId="2EF537A5">
               <wp:simplePos x="0" y="0"/>
               <wp:positionH relativeFrom="column">
                 <wp:posOffset>-1029335</wp:posOffset>
@@ -1886,329 +1885,7 @@
       <mc:AlternateContent>
         <mc:Choice Requires="wps">
           <w:drawing>
-            <wp:anchor distT="45720" distB="45720" distL="114300" distR="114300" simplePos="0" relativeHeight="251666432" behindDoc="1" locked="0" layoutInCell="1" allowOverlap="1" wp14:anchorId="10648FAF" wp14:editId="7CE8EA46">
-              <wp:simplePos x="0" y="0"/>
-              <wp:positionH relativeFrom="column">
-                <wp:posOffset>4069715</wp:posOffset>
-              </wp:positionH>
-              <wp:positionV relativeFrom="paragraph">
-                <wp:posOffset>513715</wp:posOffset>
-              </wp:positionV>
-              <wp:extent cx="2360930" cy="499110"/>
-              <wp:effectExtent l="0" t="0" r="0" b="0"/>
-              <wp:wrapTight wrapText="bothSides">
-                <wp:wrapPolygon edited="0">
-                  <wp:start x="490" y="0"/>
-                  <wp:lineTo x="490" y="20611"/>
-                  <wp:lineTo x="21067" y="20611"/>
-                  <wp:lineTo x="21067" y="0"/>
-                  <wp:lineTo x="490" y="0"/>
-                </wp:wrapPolygon>
-              </wp:wrapTight>
-              <wp:docPr id="166451498" name="مربع نص 2"/>
-              <wp:cNvGraphicFramePr>
-                <a:graphicFrameLocks xmlns:a="http://schemas.openxmlformats.org/drawingml/2006/main"/>
-              </wp:cNvGraphicFramePr>
-              <a:graphic xmlns:a="http://schemas.openxmlformats.org/drawingml/2006/main">
-                <a:graphicData uri="http://schemas.microsoft.com/office/word/2010/wordprocessingShape">
-                  <wps:wsp>
-                    <wps:cNvSpPr txBox="1">
-                      <a:spLocks noChangeArrowheads="1"/>
-                    </wps:cNvSpPr>
-                    <wps:spPr bwMode="auto">
-                      <a:xfrm flipH="1">
-                        <a:off x="0" y="0"/>
-                        <a:ext cx="2360930" cy="499110"/>
-                      </a:xfrm>
-                      <a:prstGeom prst="rect">
-                        <a:avLst/>
-                      </a:prstGeom>
-                      <a:noFill/>
-                      <a:ln w="9525">
-                        <a:noFill/>
-                        <a:miter lim="800000"/>
-                        <a:headEnd/>
-                        <a:tailEnd/>
-                      </a:ln>
-                    </wps:spPr>
-                    <wps:txbx>
-                      <w:txbxContent>
-                        <w:p>
-                          <w:pPr>
-                            <w:rPr>
-                              <w:rFonts w:ascii="Helvetica Neue W23 for SKY Reg" w:hAnsi="Helvetica Neue W23 for SKY Reg"/>
-                              <w:color w:val="FFFFFF" w:themeColor="background1"/>
-                            </w:rPr>
-                            <w:jc w:val="center"/>
-                            <w:bidi/>
-                          </w:pPr>
-                          <w:r>
-                            <w:rPr>
-                              <w:rFonts w:ascii="Helvetica Neue W23 for SKY Reg" w:hAnsi="Helvetica Neue W23 for SKY Reg"/>
-                              <w:color w:val="FFFFFF" w:themeColor="background1"/>
-                              <w:rtl/>
-                            </w:rPr>
-                            <w:t>{{signatureRightRole}}</w:t>
-                          </w:r>
-                        </w:p>
-                        <w:p>
-                          <w:pPr>
-                            <w:rPr>
-                              <w:rFonts w:ascii="Helvetica Neue W23 for SKY Reg" w:hAnsi="Helvetica Neue W23 for SKY Reg"/>
-                              <w:color w:val="FFFFFF" w:themeColor="background1"/>
-                            </w:rPr>
-                            <w:jc w:val="center"/>
-                            <w:bidi/>
-                          </w:pPr>
-                          <w:r>
-                            <w:rPr>
-                              <w:rFonts w:ascii="Helvetica Neue W23 for SKY Reg" w:hAnsi="Helvetica Neue W23 for SKY Reg"/>
-                              <w:color w:val="FFFFFF" w:themeColor="background1"/>
-                              <w:rtl/>
-                            </w:rPr>
-                            <w:t>{{signatureRightName}}</w:t>
-                          </w:r>
-                        </w:p>
-                      </w:txbxContent>
-                    </wps:txbx>
-                    <wps:bodyPr rot="0" vert="horz" wrap="square" lIns="91440" tIns="45720" rIns="91440" bIns="45720" anchor="t" anchorCtr="0">
-                      <a:noAutofit/>
-                    </wps:bodyPr>
-                  </wps:wsp>
-                </a:graphicData>
-              </a:graphic>
-              <wp14:sizeRelH relativeFrom="margin">
-                <wp14:pctWidth>40000</wp14:pctWidth>
-              </wp14:sizeRelH>
-              <wp14:sizeRelV relativeFrom="margin">
-                <wp14:pctHeight>0</wp14:pctHeight>
-              </wp14:sizeRelV>
-            </wp:anchor>
-          </w:drawing>
-        </mc:Choice>
-        <mc:Fallback>
-          <w:pict>
-            <v:shapetype w14:anchorId="10648FAF" id="_x0000_t202" coordsize="21600,21600" o:spt="202" path="m,l,21600r21600,l21600,xe">
-              <v:stroke joinstyle="miter"/>
-              <v:path gradientshapeok="t" o:connecttype="rect"/>
-            </v:shapetype>
-            <v:shape id="مربع نص 2" o:spid="_x0000_s1028" type="#_x0000_t202" style="position:absolute;left:0;text-align:left;margin-left:320.45pt;margin-top:40.45pt;width:185.9pt;height:39.3pt;flip:x;z-index:-251650048;visibility:visible;mso-wrap-style:square;mso-width-percent:400;mso-height-percent:0;mso-wrap-distance-left:9pt;mso-wrap-distance-top:3.6pt;mso-wrap-distance-right:9pt;mso-wrap-distance-bottom:3.6pt;mso-position-horizontal:absolute;mso-position-horizontal-relative:text;mso-position-vertical:absolute;mso-position-vertical-relative:text;mso-width-percent:400;mso-height-percent:0;mso-width-relative:margin;mso-height-relative:margin;v-text-anchor:top" o:gfxdata="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" filled="f" stroked="f">
-              <v:textbox>
-                <w:txbxContent>
-                  <w:p>
-                    <w:pPr>
-                      <w:rPr>
-                        <w:rFonts w:ascii="Helvetica Neue W23 for SKY Reg" w:hAnsi="Helvetica Neue W23 for SKY Reg"/>
-                        <w:color w:val="FFFFFF" w:themeColor="background1"/>
-                      </w:rPr>
-                      <w:jc w:val="center"/>
-                      <w:bidi/>
-                    </w:pPr>
-                    <w:r>
-                      <w:rPr>
-                        <w:rFonts w:ascii="Helvetica Neue W23 for SKY Reg" w:hAnsi="Helvetica Neue W23 for SKY Reg"/>
-                        <w:color w:val="FFFFFF" w:themeColor="background1"/>
-                        <w:rtl/>
-                      </w:rPr>
-                      <w:t>{{signatureRightRole}}</w:t>
-                    </w:r>
-                  </w:p>
-                  <w:p>
-                    <w:pPr>
-                      <w:rPr>
-                        <w:rFonts w:ascii="Helvetica Neue W23 for SKY Reg" w:hAnsi="Helvetica Neue W23 for SKY Reg"/>
-                        <w:color w:val="FFFFFF" w:themeColor="background1"/>
-                      </w:rPr>
-                      <w:jc w:val="center"/>
-                      <w:bidi/>
-                    </w:pPr>
-                    <w:r>
-                      <w:rPr>
-                        <w:rFonts w:ascii="Helvetica Neue W23 for SKY Reg" w:hAnsi="Helvetica Neue W23 for SKY Reg"/>
-                        <w:color w:val="FFFFFF" w:themeColor="background1"/>
-                        <w:rtl/>
-                      </w:rPr>
-                      <w:t>{{signatureRightName}}</w:t>
-                    </w:r>
-                  </w:p>
-                </w:txbxContent>
-              </v:textbox>
-              <w10:wrap type="tight"/>
-            </v:shape>
-          </w:pict>
-        </mc:Fallback>
-      </mc:AlternateContent>
-    </w:r>
-    <w:r>
-      <w:rPr>
-        <w:noProof/>
-        <w:rtl/>
-      </w:rPr>
-      <mc:AlternateContent>
-        <mc:Choice Requires="wps">
-          <w:drawing>
-            <wp:anchor distT="45720" distB="45720" distL="114300" distR="114300" simplePos="0" relativeHeight="251666432" behindDoc="1" locked="0" layoutInCell="1" allowOverlap="1" wp14:anchorId="2E741FF7" wp14:editId="BB7C7598">
-              <wp:simplePos x="0" y="0"/>
-              <wp:positionH relativeFrom="column">
-                <wp:posOffset>0</wp:posOffset>
-              </wp:positionH>
-              <wp:positionV relativeFrom="paragraph">
-                <wp:posOffset>513715</wp:posOffset>
-              </wp:positionV>
-              <wp:extent cx="2360930" cy="499110"/>
-              <wp:effectExtent l="0" t="0" r="0" b="0"/>
-              <wp:wrapTight wrapText="bothSides">
-                <wp:wrapPolygon edited="0">
-                  <wp:start x="490" y="0"/>
-                  <wp:lineTo x="490" y="20611"/>
-                  <wp:lineTo x="21067" y="20611"/>
-                  <wp:lineTo x="21067" y="0"/>
-                  <wp:lineTo x="490" y="0"/>
-                </wp:wrapPolygon>
-              </wp:wrapTight>
-              <wp:docPr id="2131893608" name="Left Signature"/>
-              <wp:cNvGraphicFramePr>
-                <a:graphicFrameLocks xmlns:a="http://schemas.openxmlformats.org/drawingml/2006/main"/>
-              </wp:cNvGraphicFramePr>
-              <a:graphic xmlns:a="http://schemas.openxmlformats.org/drawingml/2006/main">
-                <a:graphicData uri="http://schemas.microsoft.com/office/word/2010/wordprocessingShape">
-                  <wps:wsp>
-                    <wps:cNvSpPr txBox="1">
-                      <a:spLocks noChangeArrowheads="1"/>
-                    </wps:cNvSpPr>
-                    <wps:spPr bwMode="auto">
-                      <a:xfrm flipH="1">
-                        <a:off x="0" y="0"/>
-                        <a:ext cx="2360930" cy="499110"/>
-                      </a:xfrm>
-                      <a:prstGeom prst="rect">
-                        <a:avLst/>
-                      </a:prstGeom>
-                      <a:noFill/>
-                      <a:ln w="9525">
-                        <a:noFill/>
-                        <a:miter lim="800000"/>
-                        <a:headEnd/>
-                        <a:tailEnd/>
-                      </a:ln>
-                    </wps:spPr>
-                    <wps:txbx>
-                      <w:txbxContent>
-                        <w:p>
-                          <w:pPr>
-                            <w:rPr>
-                              <w:rFonts w:ascii="Helvetica Neue W23 for SKY Reg" w:hAnsi="Helvetica Neue W23 for SKY Reg"/>
-                              <w:color w:val="FFFFFF" w:themeColor="background1"/>
-                            </w:rPr>
-                            <w:jc w:val="center"/>
-                            <w:bidi/>
-                          </w:pPr>
-                          <w:r>
-                            <w:rPr>
-                              <w:rFonts w:ascii="Helvetica Neue W23 for SKY Reg" w:hAnsi="Helvetica Neue W23 for SKY Reg"/>
-                              <w:color w:val="FFFFFF" w:themeColor="background1"/>
-                              <w:rtl/>
-                            </w:rPr>
-                            <w:t>{{signatureLeftRole}}</w:t>
-                          </w:r>
-                        </w:p>
-                        <w:p>
-                          <w:pPr>
-                            <w:rPr>
-                              <w:rFonts w:ascii="Helvetica Neue W23 for SKY Reg" w:hAnsi="Helvetica Neue W23 for SKY Reg"/>
-                              <w:color w:val="FFFFFF" w:themeColor="background1"/>
-                            </w:rPr>
-                            <w:jc w:val="center"/>
-                            <w:bidi/>
-                          </w:pPr>
-                          <w:r>
-                            <w:rPr>
-                              <w:rFonts w:ascii="Helvetica Neue W23 for SKY Reg" w:hAnsi="Helvetica Neue W23 for SKY Reg"/>
-                              <w:color w:val="FFFFFF" w:themeColor="background1"/>
-                              <w:rtl/>
-                            </w:rPr>
-                            <w:t>{{signatureLeftName}}</w:t>
-                          </w:r>
-                        </w:p>
-                      </w:txbxContent>
-                    </wps:txbx>
-                    <wps:bodyPr rot="0" vert="horz" wrap="square" lIns="91440" tIns="45720" rIns="91440" bIns="45720" anchor="t" anchorCtr="0">
-                      <a:noAutofit/>
-                    </wps:bodyPr>
-                  </wps:wsp>
-                </a:graphicData>
-              </a:graphic>
-              <wp14:sizeRelH relativeFrom="margin">
-                <wp14:pctWidth>40000</wp14:pctWidth>
-              </wp14:sizeRelH>
-              <wp14:sizeRelV relativeFrom="margin">
-                <wp14:pctHeight>0</wp14:pctHeight>
-              </wp14:sizeRelV>
-            </wp:anchor>
-          </w:drawing>
-        </mc:Choice>
-        <mc:Fallback>
-          <w:pict>
-            <v:shapetype w14:anchorId="B3E9F85E" id="_x0000_t202" coordsize="21600,21600" o:spt="202" path="m,l,21600r21600,l21600,xe">
-              <v:stroke joinstyle="miter"/>
-              <v:path gradientshapeok="t" o:connecttype="rect"/>
-            </v:shapetype>
-            <v:shape id="Left Signature" o:spid="_x0000_s1029" type="#_x0000_t202" style="position:absolute;left:0;text-align:left;margin-left:0pt;margin-top:40.45pt;width:185.9pt;height:39.3pt;flip:x;z-index:-251650048;visibility:visible;mso-wrap-style:square;mso-width-percent:400;mso-height-percent:0;mso-wrap-distance-left:9pt;mso-wrap-distance-top:3.6pt;mso-wrap-distance-right:9pt;mso-wrap-distance-bottom:3.6pt;mso-position-horizontal:absolute;mso-position-horizontal-relative:text;mso-position-vertical:absolute;mso-position-vertical-relative:text;mso-width-percent:400;mso-height-percent:0;mso-width-relative:margin;mso-height-relative:margin;v-text-anchor:top" o:gfxdata="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" filled="f" stroked="f">
-              <v:textbox>
-                <w:txbxContent>
-                  <w:p>
-                    <w:pPr>
-                      <w:rPr>
-                        <w:rFonts w:ascii="Helvetica Neue W23 for SKY Reg" w:hAnsi="Helvetica Neue W23 for SKY Reg"/>
-                        <w:color w:val="FFFFFF" w:themeColor="background1"/>
-                      </w:rPr>
-                      <w:jc w:val="center"/>
-                      <w:bidi/>
-                    </w:pPr>
-                    <w:r>
-                      <w:rPr>
-                        <w:rFonts w:ascii="Helvetica Neue W23 for SKY Reg" w:hAnsi="Helvetica Neue W23 for SKY Reg"/>
-                        <w:color w:val="FFFFFF" w:themeColor="background1"/>
-                        <w:rtl/>
-                      </w:rPr>
-                      <w:t>{{signatureLeftRole}}</w:t>
-                    </w:r>
-                  </w:p>
-                  <w:p>
-                    <w:pPr>
-                      <w:rPr>
-                        <w:rFonts w:ascii="Helvetica Neue W23 for SKY Reg" w:hAnsi="Helvetica Neue W23 for SKY Reg"/>
-                        <w:color w:val="FFFFFF" w:themeColor="background1"/>
-                      </w:rPr>
-                      <w:jc w:val="center"/>
-                      <w:bidi/>
-                    </w:pPr>
-                    <w:r>
-                      <w:rPr>
-                        <w:rFonts w:ascii="Helvetica Neue W23 for SKY Reg" w:hAnsi="Helvetica Neue W23 for SKY Reg"/>
-                        <w:color w:val="FFFFFF" w:themeColor="background1"/>
-                        <w:rtl/>
-                      </w:rPr>
-                      <w:t>{{signatureLeftName}}</w:t>
-                    </w:r>
-                  </w:p>
-                </w:txbxContent>
-              </v:textbox>
-              <w10:wrap type="tight"/>
-            </v:shape>
-          </w:pict>
-        </mc:Fallback>
-      </mc:AlternateContent>
-    </w:r>
-    <w:r>
-      <w:rPr>
-        <w:noProof/>
-        <w:rtl/>
-      </w:rPr>
-      <mc:AlternateContent>
-        <mc:Choice Requires="wps">
-          <w:drawing>
-            <wp:anchor distT="45720" distB="45720" distL="114300" distR="114300" simplePos="0" relativeHeight="251665408" behindDoc="0" locked="0" layoutInCell="1" allowOverlap="1" wp14:anchorId="0E7082BF" wp14:editId="0D548646">
+            <wp:anchor distT="45720" distB="45720" distL="114300" distR="114300" simplePos="0" relativeHeight="251659264" behindDoc="0" locked="0" layoutInCell="1" allowOverlap="1" wp14:anchorId="0E7082BF" wp14:editId="0DF68588">
               <wp:simplePos x="0" y="0"/>
               <wp:positionH relativeFrom="margin">
                 <wp:align>center</wp:align>
@@ -2292,7 +1969,11 @@
         </mc:Choice>
         <mc:Fallback>
           <w:pict>
-            <v:shape w14:anchorId="0E7082BF" id="_x0000_s1029" type="#_x0000_t202" style="position:absolute;left:0;text-align:left;margin-left:0;margin-top:43.95pt;width:349pt;height:37.5pt;flip:x;z-index:251665408;visibility:visible;mso-wrap-style:square;mso-width-percent:0;mso-height-percent:0;mso-wrap-distance-left:9pt;mso-wrap-distance-top:3.6pt;mso-wrap-distance-right:9pt;mso-wrap-distance-bottom:3.6pt;mso-position-horizontal:center;mso-position-horizontal-relative:margin;mso-position-vertical:absolute;mso-position-vertical-relative:text;mso-width-percent:0;mso-height-percent:0;mso-width-relative:margin;mso-height-relative:margin;v-text-anchor:top" o:gfxdata="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" filled="f" stroked="f">
+            <v:shapetype w14:anchorId="0E7082BF" id="_x0000_t202" coordsize="21600,21600" o:spt="202" path="m,l,21600r21600,l21600,xe">
+              <v:stroke joinstyle="miter"/>
+              <v:path gradientshapeok="t" o:connecttype="rect"/>
+            </v:shapetype>
+            <v:shape id="مربع نص 2" o:spid="_x0000_s1028" type="#_x0000_t202" style="position:absolute;left:0;text-align:left;margin-left:0;margin-top:43.95pt;width:349pt;height:37.5pt;flip:x;z-index:251659264;visibility:visible;mso-wrap-style:square;mso-width-percent:0;mso-height-percent:0;mso-wrap-distance-left:9pt;mso-wrap-distance-top:3.6pt;mso-wrap-distance-right:9pt;mso-wrap-distance-bottom:3.6pt;mso-position-horizontal:center;mso-position-horizontal-relative:margin;mso-position-vertical:absolute;mso-position-vertical-relative:text;mso-width-percent:0;mso-height-percent:0;mso-width-relative:margin;mso-height-relative:margin;v-text-anchor:top" o:gfxdata="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" filled="f" stroked="f">
               <v:textbox>
                 <w:txbxContent>
                   <w:p>
@@ -2334,7 +2015,7 @@
         <w:noProof/>
       </w:rPr>
       <w:drawing>
-        <wp:anchor distT="0" distB="0" distL="114300" distR="114300" simplePos="0" relativeHeight="251664384" behindDoc="0" locked="0" layoutInCell="1" allowOverlap="1" wp14:anchorId="7EAFD756" wp14:editId="3AE4E904">
+        <wp:anchor distT="0" distB="0" distL="114300" distR="114300" simplePos="0" relativeHeight="251658240" behindDoc="0" locked="0" layoutInCell="1" allowOverlap="1" wp14:anchorId="7EAFD756" wp14:editId="3AE4E904">
           <wp:simplePos x="0" y="0"/>
           <wp:positionH relativeFrom="margin">
             <wp:align>center</wp:align>
@@ -2394,6 +2075,348 @@
     <w:pPr>
       <w:pStyle w:val="ab"/>
     </w:pPr>
+    <w:r>
+      <w:rPr>
+        <w:noProof/>
+        <w:rtl/>
+      </w:rPr>
+      <mc:AlternateContent>
+        <mc:Choice Requires="wps">
+          <w:drawing>
+            <wp:anchor distT="45720" distB="45720" distL="114300" distR="114300" simplePos="0" relativeHeight="251661312" behindDoc="1" locked="0" layoutInCell="1" allowOverlap="1" wp14:anchorId="2E741FF7" wp14:editId="5ADEA0EA">
+              <wp:simplePos x="0" y="0"/>
+              <wp:positionH relativeFrom="column">
+                <wp:posOffset>-1314450</wp:posOffset>
+              </wp:positionH>
+              <wp:positionV relativeFrom="paragraph">
+                <wp:posOffset>241935</wp:posOffset>
+              </wp:positionV>
+              <wp:extent cx="2360930" cy="499110"/>
+              <wp:effectExtent l="0" t="0" r="0" b="0"/>
+              <wp:wrapTight wrapText="bothSides">
+                <wp:wrapPolygon edited="0">
+                  <wp:start x="536" y="0"/>
+                  <wp:lineTo x="536" y="20611"/>
+                  <wp:lineTo x="20897" y="20611"/>
+                  <wp:lineTo x="20897" y="0"/>
+                  <wp:lineTo x="536" y="0"/>
+                </wp:wrapPolygon>
+              </wp:wrapTight>
+              <wp:docPr id="2131893608" name="Left Signature"/>
+              <wp:cNvGraphicFramePr>
+                <a:graphicFrameLocks xmlns:a="http://schemas.openxmlformats.org/drawingml/2006/main"/>
+              </wp:cNvGraphicFramePr>
+              <a:graphic xmlns:a="http://schemas.openxmlformats.org/drawingml/2006/main">
+                <a:graphicData uri="http://schemas.microsoft.com/office/word/2010/wordprocessingShape">
+                  <wps:wsp>
+                    <wps:cNvSpPr txBox="1">
+                      <a:spLocks noChangeArrowheads="1"/>
+                    </wps:cNvSpPr>
+                    <wps:spPr bwMode="auto">
+                      <a:xfrm flipH="1">
+                        <a:off x="0" y="0"/>
+                        <a:ext cx="2360930" cy="499110"/>
+                      </a:xfrm>
+                      <a:prstGeom prst="rect">
+                        <a:avLst/>
+                      </a:prstGeom>
+                      <a:noFill/>
+                      <a:ln w="9525">
+                        <a:noFill/>
+                        <a:miter lim="800000"/>
+                        <a:headEnd/>
+                        <a:tailEnd/>
+                      </a:ln>
+                    </wps:spPr>
+                    <wps:txbx>
+                      <w:txbxContent>
+                        <w:p>
+                          <w:pPr>
+                            <w:jc w:val="center"/>
+                            <w:rPr>
+                              <w:rFonts w:ascii="Helvetica Neue W23 for SKY Reg" w:hAnsi="Helvetica Neue W23 for SKY Reg"/>
+                              <w:color w:val="FFFFFF" w:themeColor="background1"/>
+                            </w:rPr>
+                          </w:pPr>
+                          <w:r>
+                            <w:rPr>
+                              <w:rFonts w:ascii="Helvetica Neue W23 for SKY Reg" w:hAnsi="Helvetica Neue W23 for SKY Reg"/>
+                              <w:color w:val="FFFFFF" w:themeColor="background1"/>
+                              <w:rtl/>
+                            </w:rPr>
+                            <w:t>{{</w:t>
+                          </w:r>
+                          <w:proofErr w:type="spellStart"/>
+                          <w:r>
+                            <w:rPr>
+                              <w:rFonts w:ascii="Helvetica Neue W23 for SKY Reg" w:hAnsi="Helvetica Neue W23 for SKY Reg"/>
+                              <w:color w:val="FFFFFF" w:themeColor="background1"/>
+                              <w:rtl/>
+                            </w:rPr>
+                            <w:t>signatureLeftRole</w:t>
+                          </w:r>
+                          <w:proofErr w:type="spellEnd"/>
+                          <w:r>
+                            <w:rPr>
+                              <w:rFonts w:ascii="Helvetica Neue W23 for SKY Reg" w:hAnsi="Helvetica Neue W23 for SKY Reg"/>
+                              <w:color w:val="FFFFFF" w:themeColor="background1"/>
+                              <w:rtl/>
+                            </w:rPr>
+                            <w:t>}}</w:t>
+                          </w:r>
+                        </w:p>
+                        <w:p>
+                          <w:pPr>
+                            <w:jc w:val="center"/>
+                            <w:rPr>
+                              <w:rFonts w:ascii="Helvetica Neue W23 for SKY Reg" w:hAnsi="Helvetica Neue W23 for SKY Reg"/>
+                              <w:color w:val="FFFFFF" w:themeColor="background1"/>
+                            </w:rPr>
+                          </w:pPr>
+                          <w:r>
+                            <w:rPr>
+                              <w:rFonts w:ascii="Helvetica Neue W23 for SKY Reg" w:hAnsi="Helvetica Neue W23 for SKY Reg"/>
+                              <w:color w:val="FFFFFF" w:themeColor="background1"/>
+                              <w:rtl/>
+                            </w:rPr>
+                            <w:t>{{signatureLeftName}}</w:t>
+                          </w:r>
+                        </w:p>
+                      </w:txbxContent>
+                    </wps:txbx>
+                    <wps:bodyPr rot="0" vert="horz" wrap="square" lIns="91440" tIns="45720" rIns="91440" bIns="45720" anchor="t" anchorCtr="0">
+                      <a:noAutofit/>
+                    </wps:bodyPr>
+                  </wps:wsp>
+                </a:graphicData>
+              </a:graphic>
+              <wp14:sizeRelH relativeFrom="margin">
+                <wp14:pctWidth>40000</wp14:pctWidth>
+              </wp14:sizeRelH>
+              <wp14:sizeRelV relativeFrom="margin">
+                <wp14:pctHeight>0</wp14:pctHeight>
+              </wp14:sizeRelV>
+            </wp:anchor>
+          </w:drawing>
+        </mc:Choice>
+        <mc:Fallback>
+          <w:pict>
+            <v:shape w14:anchorId="2E741FF7" id="Left Signature" o:spid="_x0000_s1029" type="#_x0000_t202" style="position:absolute;left:0;text-align:left;margin-left:-103.5pt;margin-top:19.05pt;width:185.9pt;height:39.3pt;flip:x;z-index:-251655168;visibility:visible;mso-wrap-style:square;mso-width-percent:400;mso-height-percent:0;mso-wrap-distance-left:9pt;mso-wrap-distance-top:3.6pt;mso-wrap-distance-right:9pt;mso-wrap-distance-bottom:3.6pt;mso-position-horizontal:absolute;mso-position-horizontal-relative:text;mso-position-vertical:absolute;mso-position-vertical-relative:text;mso-width-percent:400;mso-height-percent:0;mso-width-relative:margin;mso-height-relative:margin;v-text-anchor:top" o:gfxdata="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" filled="f" stroked="f">
+              <v:textbox>
+                <w:txbxContent>
+                  <w:p>
+                    <w:pPr>
+                      <w:jc w:val="center"/>
+                      <w:rPr>
+                        <w:rFonts w:ascii="Helvetica Neue W23 for SKY Reg" w:hAnsi="Helvetica Neue W23 for SKY Reg"/>
+                        <w:color w:val="FFFFFF" w:themeColor="background1"/>
+                      </w:rPr>
+                    </w:pPr>
+                    <w:r>
+                      <w:rPr>
+                        <w:rFonts w:ascii="Helvetica Neue W23 for SKY Reg" w:hAnsi="Helvetica Neue W23 for SKY Reg"/>
+                        <w:color w:val="FFFFFF" w:themeColor="background1"/>
+                        <w:rtl/>
+                      </w:rPr>
+                      <w:t>{{</w:t>
+                    </w:r>
+                    <w:proofErr w:type="spellStart"/>
+                    <w:r>
+                      <w:rPr>
+                        <w:rFonts w:ascii="Helvetica Neue W23 for SKY Reg" w:hAnsi="Helvetica Neue W23 for SKY Reg"/>
+                        <w:color w:val="FFFFFF" w:themeColor="background1"/>
+                        <w:rtl/>
+                      </w:rPr>
+                      <w:t>signatureLeftRole</w:t>
+                    </w:r>
+                    <w:proofErr w:type="spellEnd"/>
+                    <w:r>
+                      <w:rPr>
+                        <w:rFonts w:ascii="Helvetica Neue W23 for SKY Reg" w:hAnsi="Helvetica Neue W23 for SKY Reg"/>
+                        <w:color w:val="FFFFFF" w:themeColor="background1"/>
+                        <w:rtl/>
+                      </w:rPr>
+                      <w:t>}}</w:t>
+                    </w:r>
+                  </w:p>
+                  <w:p>
+                    <w:pPr>
+                      <w:jc w:val="center"/>
+                      <w:rPr>
+                        <w:rFonts w:ascii="Helvetica Neue W23 for SKY Reg" w:hAnsi="Helvetica Neue W23 for SKY Reg"/>
+                        <w:color w:val="FFFFFF" w:themeColor="background1"/>
+                      </w:rPr>
+                    </w:pPr>
+                    <w:r>
+                      <w:rPr>
+                        <w:rFonts w:ascii="Helvetica Neue W23 for SKY Reg" w:hAnsi="Helvetica Neue W23 for SKY Reg"/>
+                        <w:color w:val="FFFFFF" w:themeColor="background1"/>
+                        <w:rtl/>
+                      </w:rPr>
+                      <w:t>{{signatureLeftName}}</w:t>
+                    </w:r>
+                  </w:p>
+                </w:txbxContent>
+              </v:textbox>
+              <w10:wrap type="tight"/>
+            </v:shape>
+          </w:pict>
+        </mc:Fallback>
+      </mc:AlternateContent>
+    </w:r>
+    <w:r>
+      <w:rPr>
+        <w:noProof/>
+        <w:rtl/>
+      </w:rPr>
+      <mc:AlternateContent>
+        <mc:Choice Requires="wps">
+          <w:drawing>
+            <wp:anchor distT="45720" distB="45720" distL="114300" distR="114300" simplePos="0" relativeHeight="251660288" behindDoc="1" locked="0" layoutInCell="1" allowOverlap="1" wp14:anchorId="10648FAF" wp14:editId="31112C68">
+              <wp:simplePos x="0" y="0"/>
+              <wp:positionH relativeFrom="margin">
+                <wp:posOffset>4703445</wp:posOffset>
+              </wp:positionH>
+              <wp:positionV relativeFrom="paragraph">
+                <wp:posOffset>241935</wp:posOffset>
+              </wp:positionV>
+              <wp:extent cx="2360930" cy="499110"/>
+              <wp:effectExtent l="0" t="0" r="0" b="0"/>
+              <wp:wrapTight wrapText="bothSides">
+                <wp:wrapPolygon edited="0">
+                  <wp:start x="536" y="0"/>
+                  <wp:lineTo x="536" y="20611"/>
+                  <wp:lineTo x="20897" y="20611"/>
+                  <wp:lineTo x="20897" y="0"/>
+                  <wp:lineTo x="536" y="0"/>
+                </wp:wrapPolygon>
+              </wp:wrapTight>
+              <wp:docPr id="166451498" name="مربع نص 2"/>
+              <wp:cNvGraphicFramePr>
+                <a:graphicFrameLocks xmlns:a="http://schemas.openxmlformats.org/drawingml/2006/main"/>
+              </wp:cNvGraphicFramePr>
+              <a:graphic xmlns:a="http://schemas.openxmlformats.org/drawingml/2006/main">
+                <a:graphicData uri="http://schemas.microsoft.com/office/word/2010/wordprocessingShape">
+                  <wps:wsp>
+                    <wps:cNvSpPr txBox="1">
+                      <a:spLocks noChangeArrowheads="1"/>
+                    </wps:cNvSpPr>
+                    <wps:spPr bwMode="auto">
+                      <a:xfrm flipH="1">
+                        <a:off x="0" y="0"/>
+                        <a:ext cx="2360930" cy="499110"/>
+                      </a:xfrm>
+                      <a:prstGeom prst="rect">
+                        <a:avLst/>
+                      </a:prstGeom>
+                      <a:noFill/>
+                      <a:ln w="9525">
+                        <a:noFill/>
+                        <a:miter lim="800000"/>
+                        <a:headEnd/>
+                        <a:tailEnd/>
+                      </a:ln>
+                    </wps:spPr>
+                    <wps:txbx>
+                      <w:txbxContent>
+                        <w:p>
+                          <w:pPr>
+                            <w:jc w:val="center"/>
+                            <w:rPr>
+                              <w:rFonts w:ascii="Helvetica Neue W23 for SKY Reg" w:hAnsi="Helvetica Neue W23 for SKY Reg"/>
+                              <w:color w:val="FFFFFF" w:themeColor="background1"/>
+                            </w:rPr>
+                          </w:pPr>
+                          <w:r>
+                            <w:rPr>
+                              <w:rFonts w:ascii="Helvetica Neue W23 for SKY Reg" w:hAnsi="Helvetica Neue W23 for SKY Reg"/>
+                              <w:color w:val="FFFFFF" w:themeColor="background1"/>
+                              <w:rtl/>
+                            </w:rPr>
+                            <w:t>{{signatureRightRole}}</w:t>
+                          </w:r>
+                        </w:p>
+                        <w:p>
+                          <w:pPr>
+                            <w:jc w:val="center"/>
+                            <w:rPr>
+                              <w:rFonts w:ascii="Helvetica Neue W23 for SKY Reg" w:hAnsi="Helvetica Neue W23 for SKY Reg"/>
+                              <w:color w:val="FFFFFF" w:themeColor="background1"/>
+                            </w:rPr>
+                          </w:pPr>
+                          <w:r>
+                            <w:rPr>
+                              <w:rFonts w:ascii="Helvetica Neue W23 for SKY Reg" w:hAnsi="Helvetica Neue W23 for SKY Reg"/>
+                              <w:color w:val="FFFFFF" w:themeColor="background1"/>
+                              <w:rtl/>
+                            </w:rPr>
+                            <w:t>{{signatureRightName}}</w:t>
+                          </w:r>
+                        </w:p>
+                      </w:txbxContent>
+                    </wps:txbx>
+                    <wps:bodyPr rot="0" vert="horz" wrap="square" lIns="91440" tIns="45720" rIns="91440" bIns="45720" anchor="t" anchorCtr="0">
+                      <a:noAutofit/>
+                    </wps:bodyPr>
+                  </wps:wsp>
+                </a:graphicData>
+              </a:graphic>
+              <wp14:sizeRelH relativeFrom="margin">
+                <wp14:pctWidth>40000</wp14:pctWidth>
+              </wp14:sizeRelH>
+              <wp14:sizeRelV relativeFrom="margin">
+                <wp14:pctHeight>0</wp14:pctHeight>
+              </wp14:sizeRelV>
+            </wp:anchor>
+          </w:drawing>
+        </mc:Choice>
+        <mc:Fallback>
+          <w:pict>
+            <v:shape w14:anchorId="10648FAF" id="_x0000_s1030" type="#_x0000_t202" style="position:absolute;left:0;text-align:left;margin-left:370.35pt;margin-top:19.05pt;width:185.9pt;height:39.3pt;flip:x;z-index:-251656192;visibility:visible;mso-wrap-style:square;mso-width-percent:400;mso-height-percent:0;mso-wrap-distance-left:9pt;mso-wrap-distance-top:3.6pt;mso-wrap-distance-right:9pt;mso-wrap-distance-bottom:3.6pt;mso-position-horizontal:absolute;mso-position-horizontal-relative:margin;mso-position-vertical:absolute;mso-position-vertical-relative:text;mso-width-percent:400;mso-height-percent:0;mso-width-relative:margin;mso-height-relative:margin;v-text-anchor:top" o:gfxdata="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" filled="f" stroked="f">
+              <v:textbox>
+                <w:txbxContent>
+                  <w:p>
+                    <w:pPr>
+                      <w:jc w:val="center"/>
+                      <w:rPr>
+                        <w:rFonts w:ascii="Helvetica Neue W23 for SKY Reg" w:hAnsi="Helvetica Neue W23 for SKY Reg"/>
+                        <w:color w:val="FFFFFF" w:themeColor="background1"/>
+                      </w:rPr>
+                    </w:pPr>
+                    <w:r>
+                      <w:rPr>
+                        <w:rFonts w:ascii="Helvetica Neue W23 for SKY Reg" w:hAnsi="Helvetica Neue W23 for SKY Reg"/>
+                        <w:color w:val="FFFFFF" w:themeColor="background1"/>
+                        <w:rtl/>
+                      </w:rPr>
+                      <w:t>{{signatureRightRole}}</w:t>
+                    </w:r>
+                  </w:p>
+                  <w:p>
+                    <w:pPr>
+                      <w:jc w:val="center"/>
+                      <w:rPr>
+                        <w:rFonts w:ascii="Helvetica Neue W23 for SKY Reg" w:hAnsi="Helvetica Neue W23 for SKY Reg"/>
+                        <w:color w:val="FFFFFF" w:themeColor="background1"/>
+                      </w:rPr>
+                    </w:pPr>
+                    <w:r>
+                      <w:rPr>
+                        <w:rFonts w:ascii="Helvetica Neue W23 for SKY Reg" w:hAnsi="Helvetica Neue W23 for SKY Reg"/>
+                        <w:color w:val="FFFFFF" w:themeColor="background1"/>
+                        <w:rtl/>
+                      </w:rPr>
+                      <w:t>{{signatureRightName}}</w:t>
+                    </w:r>
+                  </w:p>
+                </w:txbxContent>
+              </v:textbox>
+              <w10:wrap type="tight" anchorx="margin"/>
+            </v:shape>
+          </w:pict>
+        </mc:Fallback>
+      </mc:AlternateContent>
+    </w:r>
   </w:p>
 </w:ftr>
 </file>
@@ -2438,7 +2461,7 @@
       <mc:AlternateContent>
         <mc:Choice Requires="wps">
           <w:drawing>
-            <wp:anchor distT="45720" distB="45720" distL="114300" distR="114300" simplePos="0" relativeHeight="251661312" behindDoc="0" locked="0" layoutInCell="1" allowOverlap="1" wp14:anchorId="4A7F0EDE" wp14:editId="18EE5881">
+            <wp:anchor distT="45720" distB="45720" distL="114300" distR="114300" simplePos="0" relativeHeight="251656192" behindDoc="0" locked="0" layoutInCell="1" allowOverlap="1" wp14:anchorId="4A7F0EDE" wp14:editId="18EE5881">
               <wp:simplePos x="0" y="0"/>
               <wp:positionH relativeFrom="margin">
                 <wp:align>left</wp:align>
@@ -2611,7 +2634,7 @@
               <v:stroke joinstyle="miter"/>
               <v:path gradientshapeok="t" o:connecttype="rect"/>
             </v:shapetype>
-            <v:shape id="مربع نص 1722858123" o:spid="_x0000_s1026" type="#_x0000_t202" style="position:absolute;margin-left:0;margin-top:.35pt;width:262.25pt;height:66pt;flip:x;z-index:251661312;visibility:visible;mso-wrap-style:square;mso-width-percent:0;mso-height-percent:0;mso-wrap-distance-left:9pt;mso-wrap-distance-top:3.6pt;mso-wrap-distance-right:9pt;mso-wrap-distance-bottom:3.6pt;mso-position-horizontal:left;mso-position-horizontal-relative:margin;mso-position-vertical:absolute;mso-position-vertical-relative:text;mso-width-percent:0;mso-height-percent:0;mso-width-relative:margin;mso-height-relative:margin;v-text-anchor:middle" o:gfxdata="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" filled="f" stroked="f">
+            <v:shape id="مربع نص 1722858123" o:spid="_x0000_s1026" type="#_x0000_t202" style="position:absolute;margin-left:0;margin-top:.35pt;width:262.25pt;height:66pt;flip:x;z-index:251656192;visibility:visible;mso-wrap-style:square;mso-width-percent:0;mso-height-percent:0;mso-wrap-distance-left:9pt;mso-wrap-distance-top:3.6pt;mso-wrap-distance-right:9pt;mso-wrap-distance-bottom:3.6pt;mso-position-horizontal:left;mso-position-horizontal-relative:margin;mso-position-vertical:absolute;mso-position-vertical-relative:text;mso-width-percent:0;mso-height-percent:0;mso-width-relative:margin;mso-height-relative:margin;v-text-anchor:middle" o:gfxdata="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" filled="f" stroked="f">
               <v:textbox inset="4pt,2pt,4pt,2pt">
                 <w:txbxContent>
                   <w:p>
@@ -2738,7 +2761,7 @@
         <w:noProof/>
       </w:rPr>
       <w:drawing>
-        <wp:anchor distT="0" distB="0" distL="114300" distR="114300" simplePos="0" relativeHeight="251659264" behindDoc="0" locked="0" layoutInCell="1" allowOverlap="1" wp14:anchorId="1357CF76" wp14:editId="7A4FF658">
+        <wp:anchor distT="0" distB="0" distL="114300" distR="114300" simplePos="0" relativeHeight="251654144" behindDoc="0" locked="0" layoutInCell="1" allowOverlap="1" wp14:anchorId="1357CF76" wp14:editId="7A4FF658">
           <wp:simplePos x="0" y="0"/>
           <wp:positionH relativeFrom="page">
             <wp:align>left</wp:align>
@@ -2811,7 +2834,7 @@
       <mc:AlternateContent>
         <mc:Choice Requires="wps">
           <w:drawing>
-            <wp:anchor distT="45720" distB="45720" distL="114300" distR="114300" simplePos="0" relativeHeight="251660288" behindDoc="0" locked="0" layoutInCell="1" allowOverlap="1" wp14:anchorId="6CCA5EC2" wp14:editId="2B81C1B1">
+            <wp:anchor distT="45720" distB="45720" distL="114300" distR="114300" simplePos="0" relativeHeight="251655168" behindDoc="0" locked="0" layoutInCell="1" allowOverlap="1" wp14:anchorId="6CCA5EC2" wp14:editId="2B81C1B1">
               <wp:simplePos x="0" y="0"/>
               <wp:positionH relativeFrom="margin">
                 <wp:align>center</wp:align>
@@ -2933,7 +2956,7 @@
         </mc:Choice>
         <mc:Fallback>
           <w:pict>
-            <v:shape w14:anchorId="6CCA5EC2" id="مربع نص 1958827686" o:spid="_x0000_s1027" type="#_x0000_t202" style="position:absolute;left:0;text-align:left;margin-left:0;margin-top:38pt;width:193.4pt;height:36pt;flip:x;z-index:251660288;visibility:visible;mso-wrap-style:square;mso-width-percent:0;mso-height-percent:0;mso-wrap-distance-left:9pt;mso-wrap-distance-top:3.6pt;mso-wrap-distance-right:9pt;mso-wrap-distance-bottom:3.6pt;mso-position-horizontal:center;mso-position-horizontal-relative:margin;mso-position-vertical:absolute;mso-position-vertical-relative:text;mso-width-percent:0;mso-height-percent:0;mso-width-relative:margin;mso-height-relative:margin;v-text-anchor:top" o:gfxdata="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" filled="f" stroked="f">
+            <v:shape w14:anchorId="6CCA5EC2" id="مربع نص 1958827686" o:spid="_x0000_s1027" type="#_x0000_t202" style="position:absolute;left:0;text-align:left;margin-left:0;margin-top:38pt;width:193.4pt;height:36pt;flip:x;z-index:251655168;visibility:visible;mso-wrap-style:square;mso-width-percent:0;mso-height-percent:0;mso-wrap-distance-left:9pt;mso-wrap-distance-top:3.6pt;mso-wrap-distance-right:9pt;mso-wrap-distance-bottom:3.6pt;mso-position-horizontal:center;mso-position-horizontal-relative:margin;mso-position-vertical:absolute;mso-position-vertical-relative:text;mso-width-percent:0;mso-height-percent:0;mso-width-relative:margin;mso-height-relative:margin;v-text-anchor:top" o:gfxdata="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" filled="f" stroked="f">
               <v:textbox>
                 <w:txbxContent>
                   <w:p>
@@ -4167,6 +4190,7 @@
   <w:style w:type="character" w:default="1" w:styleId="a0">
     <w:name w:val="Default Paragraph Font"/>
     <w:uiPriority w:val="1"/>
+    <w:semiHidden/>
     <w:unhideWhenUsed/>
   </w:style>
   <w:style w:type="table" w:default="1" w:styleId="a1">

</xml_diff>

<commit_message>
Update manager report signature templates
</commit_message>
<xml_diff>
--- a/assets/report-templates/manager-reports/academic-achievement-committee.docx
+++ b/assets/report-templates/manager-reports/academic-achievement-committee.docx
@@ -89,20 +89,39 @@
         <w:rPr>
           <w:rtl/>
         </w:rPr>
-        <w:t>هـ .</w:t>
+        <w:t>هـ</w:t>
       </w:r>
       <w:r>
         <w:rPr>
           <w:rFonts w:hint="cs"/>
           <w:rtl/>
         </w:rPr>
-        <w:t xml:space="preserve"> </w:t>
-      </w:r>
-      <w:r>
-        <w:rPr>
-          <w:rtl/>
-        </w:rPr>
-        <w:t>واستناداً إلى ما ورد في الدليل التنظيمي لمدارس التعليم العام 1442هـ ، بتكليف أعضاء الفريق من قبل اللجنة الإدارية فقد تقرر ما يلي :</w:t>
+        <w:t xml:space="preserve">. </w:t>
+      </w:r>
+      <w:r>
+        <w:rPr>
+          <w:rtl/>
+        </w:rPr>
+        <w:t>واستناداً إلى ما ورد في الدليل التنظيمي لمدارس التعليم العام 1442هـ</w:t>
+      </w:r>
+      <w:r>
+        <w:rPr>
+          <w:rtl/>
+        </w:rPr>
+        <w:t>،</w:t>
+      </w:r>
+      <w:r>
+        <w:rPr>
+          <w:rtl/>
+        </w:rPr>
+        <w:t xml:space="preserve"> بتكليف أعضاء الفريق من قبل اللجنة الإدارية فقد تقرر ما يلي</w:t>
+      </w:r>
+      <w:r>
+        <w:rPr>
+          <w:rFonts w:hint="cs"/>
+          <w:rtl/>
+        </w:rPr>
+        <w:t>:</w:t>
       </w:r>
     </w:p>
     <w:p>
@@ -141,7 +160,13 @@
         <w:rPr>
           <w:rtl/>
         </w:rPr>
-        <w:t xml:space="preserve"> . وفقاً للجدول التالي:</w:t>
+        <w:t>.</w:t>
+      </w:r>
+      <w:r>
+        <w:rPr>
+          <w:rtl/>
+        </w:rPr>
+        <w:t xml:space="preserve"> وفقاً للجدول التالي:</w:t>
       </w:r>
     </w:p>
     <w:tbl>
@@ -1299,7 +1324,20 @@
         <w:rPr>
           <w:rtl/>
         </w:rPr>
-        <w:t>تزويد معلمي المواد الدراسية بالتقارير المعتمدة لتحليل نتائج التحصيل للاختبارات بمختلف أنواعها والمتعلقة بتخصصية موادهم، وتوصيات اللجنة بشأنها.</w:t>
+        <w:t>تزويد معلمي المواد الدراسية بالتقارير المعتمدة لتحليل نتائج التحصيل للاختبارات بمختلف أنواعها والمتعلقة بتخصصية موادهم</w:t>
+      </w:r>
+      <w:r>
+        <w:rPr>
+          <w:rFonts w:hint="cs"/>
+          <w:rtl/>
+        </w:rPr>
+        <w:t>،</w:t>
+      </w:r>
+      <w:r>
+        <w:rPr>
+          <w:rtl/>
+        </w:rPr>
+        <w:t xml:space="preserve"> وتوصيات اللجنة بشأنها.</w:t>
       </w:r>
     </w:p>
     <w:p>
@@ -1404,7 +1442,14 @@
         <w:rPr>
           <w:rtl/>
         </w:rPr>
-        <w:t>استلام مظاريف أوراق الأسئلة والإجابات الخاصة بها، وحفظها في الأماكن الآمنة المخصصة لها. و</w:t>
+        <w:t>استلام مظاريف أوراق الأسئلة والإجابات الخاصة بها، وحفظها في الأماكن الآمنة المخصصة لها. وإعداد الكشوفات وأرقام الجلوس للطلاب وتسليمها للفرق الفرعية المسؤولة عن عملية تنظيم الاختبارات</w:t>
+      </w:r>
+      <w:r>
+        <w:rPr>
+          <w:rFonts w:hint="cs"/>
+          <w:rtl/>
+        </w:rPr>
+        <w:t>.</w:t>
       </w:r>
     </w:p>
     <w:p>
@@ -1420,8 +1465,43 @@
         <w:rPr>
           <w:rtl/>
         </w:rPr>
-        <w:t>إعداد الكشوفات وأرقام الجلوس للطلاب وتسليمها للفرق الفرعية المسؤولة عن عملية تنظيم الاختبارات</w:t>
-      </w:r>
+        <w:t>توضيح التعليمات للتعامل مع الحالات الطارئة (المرضية، مخالفة الأنظمة والتعليمات...) أثناء الاختبارات وتهيئة الأدوات والمكان المناسب.</w:t>
+      </w:r>
+    </w:p>
+    <w:p>
+      <w:pPr>
+        <w:pStyle w:val="a6"/>
+        <w:ind w:left="1080"/>
+      </w:pPr>
+    </w:p>
+    <w:p>
+      <w:pPr>
+        <w:rPr>
+          <w:rtl/>
+        </w:rPr>
+      </w:pPr>
+    </w:p>
+    <w:p/>
+    <w:p>
+      <w:pPr>
+        <w:rPr>
+          <w:rtl/>
+        </w:rPr>
+      </w:pPr>
+    </w:p>
+    <w:p>
+      <w:pPr>
+        <w:rPr>
+          <w:rtl/>
+        </w:rPr>
+      </w:pPr>
+    </w:p>
+    <w:p>
+      <w:pPr>
+        <w:rPr>
+          <w:rtl/>
+        </w:rPr>
+      </w:pPr>
     </w:p>
     <w:p>
       <w:pPr>
@@ -1431,42 +1511,29 @@
           <w:numId w:val="4"/>
         </w:numPr>
         <w:ind w:left="1080" w:hanging="720"/>
-      </w:pPr>
-      <w:r>
-        <w:rPr>
-          <w:rtl/>
-        </w:rPr>
-        <w:t>.توضيح التعليمات للتعامل مع الحالات الطارئة (المرضية ، مخالفة الأنظمة والتعليمات...) أثناء الاختبارات وتهيئة الأدوات والمكان المناسب.</w:t>
-      </w:r>
-    </w:p>
-    <w:p>
-      <w:pPr>
-        <w:rPr>
-          <w:rtl/>
-        </w:rPr>
-      </w:pPr>
-    </w:p>
-    <w:p/>
-    <w:p>
-      <w:pPr>
-        <w:rPr>
-          <w:rtl/>
-        </w:rPr>
-      </w:pPr>
-    </w:p>
-    <w:p>
-      <w:pPr>
-        <w:rPr>
-          <w:rtl/>
-        </w:rPr>
-      </w:pPr>
-    </w:p>
-    <w:p>
-      <w:pPr>
-        <w:rPr>
-          <w:rtl/>
-        </w:rPr>
-      </w:pPr>
+        <w:rPr>
+          <w:rtl/>
+        </w:rPr>
+      </w:pPr>
+      <w:r>
+        <w:rPr>
+          <w:rtl/>
+        </w:rPr>
+        <w:t>الإشراف على سير الاختبارات والبرامج التنفيذية المتعلقة بها بمختلف أنواعها بالمدرسة ومتابعتها، والتأكد من مدى سلامتها</w:t>
+      </w:r>
+      <w:r>
+        <w:rPr>
+          <w:rFonts w:hint="cs"/>
+          <w:rtl/>
+        </w:rPr>
+        <w:t>.</w:t>
+      </w:r>
+      <w:r>
+        <w:rPr>
+          <w:rtl/>
+        </w:rPr>
+        <w:t xml:space="preserve"> </w:t>
+      </w:r>
     </w:p>
     <w:p>
       <w:pPr>
@@ -1484,7 +1551,7 @@
         <w:rPr>
           <w:rtl/>
         </w:rPr>
-        <w:t xml:space="preserve">الإشراف على سير الاختبارات والبرامج التنفيذية المتعلقة بها بمختلف أنواعها بالمدرسة ومتابعتها، والتأكد من مدى سلامتها </w:t>
+        <w:t>متابعة عمليات التصحيح والمراجعة للاختبارات وتدقيق النتائج في المدرسة، ومتابعة أعمال الرصد وإخراج النتائج وتسليمها وحفظها.</w:t>
       </w:r>
     </w:p>
     <w:p>
@@ -1503,7 +1570,7 @@
         <w:rPr>
           <w:rtl/>
         </w:rPr>
-        <w:t>متابعة عمليات التصحيح والمراجعة للاختبارات وتدقيق النتائج في المدرسة، ومتابعة أعمال الرصد وإخراج النتائج وتسليمها وحفظها.</w:t>
+        <w:t>تقديم المقترحات التطويرية لآلية الاختبار وتقديمها للجهات المعنية، ومتابعة ومراجعة جميع التعديلات على آليات الاختبارات وتطبيقها.</w:t>
       </w:r>
     </w:p>
     <w:p>
@@ -1522,7 +1589,7 @@
         <w:rPr>
           <w:rtl/>
         </w:rPr>
-        <w:t>تقديم المقترحات التطويرية لآلية الاختبار وتقديمها للجهات المعنية، ومتابعة ومراجعة جميع التعديلات على آليات الاختبارات وتطبيقها.</w:t>
+        <w:t>إعداد وتوثيق تقارير دورية عن أعمال اللجنة والمعوقات التي تواجهها ورفعها إلى مدير المدرسة لاتخاذ الإجراء اللازم.</w:t>
       </w:r>
     </w:p>
     <w:p>
@@ -1541,7 +1608,7 @@
         <w:rPr>
           <w:rtl/>
         </w:rPr>
-        <w:t>إعداد وتوثيق تقارير دورية عن أعمال اللجنة والمعوقات التي تواجهها ورفعها إلى مدير المدرسة لاتخاذ الإجراء اللازم.</w:t>
+        <w:t>اقتراح برامج معالجة التأخر الدراسي واعتماد الحصص الإضافية لها وتكليف المعلمين واشعار أولياء الأمور بالبرنامج.</w:t>
       </w:r>
     </w:p>
     <w:p>
@@ -1560,7 +1627,14 @@
         <w:rPr>
           <w:rtl/>
         </w:rPr>
-        <w:t>اقتراح برامج معالجة التأخر الدراسي واعتماد الحصص الإضافية لها وتكليف المعلمين واشعار أولياء الأمور بالبرنامج.</w:t>
+        <w:t>اقتراح البرامج والأنشطة اللاصفية التي تدعم نواتج التعليم والتعلم</w:t>
+      </w:r>
+      <w:r>
+        <w:rPr>
+          <w:rFonts w:hint="cs"/>
+          <w:rtl/>
+        </w:rPr>
+        <w:t>.</w:t>
       </w:r>
     </w:p>
     <w:p>
@@ -1579,7 +1653,7 @@
         <w:rPr>
           <w:rtl/>
         </w:rPr>
-        <w:t>اقتراح البرامج والأنشطة اللاصفية التي تدعم نواتج التعليم والتعلم</w:t>
+        <w:t>قياس رضا أولياء الأمور عن التحصيل الدراسي ونتائجه، وإشراكهم في معالجات ضعف التحصيل الدراسي لأبنائهم.</w:t>
       </w:r>
     </w:p>
     <w:p>
@@ -1590,162 +1664,501 @@
           <w:numId w:val="4"/>
         </w:numPr>
         <w:ind w:left="1080" w:hanging="720"/>
-        <w:rPr>
-          <w:rtl/>
-        </w:rPr>
-      </w:pPr>
-      <w:r>
-        <w:rPr>
-          <w:rtl/>
-        </w:rPr>
-        <w:t>قياس رضا أولياء الأمور عن التحصيل الدراسي ونتائجه، وإشراكهم في معالجات ضعف التحصيل الدراسي لأبنائهم.</w:t>
+      </w:pPr>
+      <w:r>
+        <w:rPr>
+          <w:rtl/>
+        </w:rPr>
+        <w:t>متابعة وقياس مدى فاعلية تطبيق معايير وإجراءات برنامج تحسين الأداء الكتابي والقرائي لدى الطلاب والطالبات في المرحلة الابتدائية، بما يسهم في رفع مستوى التحصيل الدراسي للطلاب بعد تنفيذ هذه الإجراءات.</w:t>
       </w:r>
     </w:p>
     <w:p>
       <w:pPr>
-        <w:pStyle w:val="a6"/>
-        <w:numPr>
-          <w:ilvl w:val="0"/>
-          <w:numId w:val="4"/>
-        </w:numPr>
-        <w:ind w:left="1080" w:hanging="720"/>
-      </w:pPr>
-      <w:r>
-        <w:rPr>
-          <w:rtl/>
-        </w:rPr>
-        <w:t>متابعة وقياس مدى فاعلية تطبيق معايير وإجراءات برنامج تحسين الأداء الكتابي والقرائي لدى الطلاب والطالبات في المرحلة الابتدائية، بما يسهم في رفع مستوى التحصيل الدراسي للطلاب بعد تنفيذ هذه الإجراءات.</w:t>
-      </w:r>
+        <w:rPr>
+          <w:rtl/>
+        </w:rPr>
+      </w:pPr>
     </w:p>
     <w:p>
-      <w:pPr>
-        <w:rPr>
-          <w:rtl/>
-        </w:rPr>
-      </w:pPr>
+      <w:r>
+        <w:rPr>
+          <w:noProof/>
+          <w:rtl/>
+        </w:rPr>
+        <mc:AlternateContent>
+          <mc:Choice Requires="wps">
+            <w:drawing>
+              <wp:anchor distT="45720" distB="45720" distL="114300" distR="114300" simplePos="0" relativeHeight="251659264" behindDoc="0" locked="0" layoutInCell="1" allowOverlap="1" wp14:anchorId="0831379A" wp14:editId="6E878DF0">
+                <wp:simplePos x="0" y="0"/>
+                <wp:positionH relativeFrom="margin">
+                  <wp:align>right</wp:align>
+                </wp:positionH>
+                <wp:positionV relativeFrom="paragraph">
+                  <wp:posOffset>1266190</wp:posOffset>
+                </wp:positionV>
+                <wp:extent cx="1868170" cy="1266825"/>
+                <wp:effectExtent l="0" t="0" r="0" b="0"/>
+                <wp:wrapSquare wrapText="bothSides"/>
+                <wp:docPr id="1606200359" name="مربع نص 2"/>
+                <wp:cNvGraphicFramePr>
+                  <a:graphicFrameLocks xmlns:a="http://schemas.openxmlformats.org/drawingml/2006/main"/>
+                </wp:cNvGraphicFramePr>
+                <a:graphic xmlns:a="http://schemas.openxmlformats.org/drawingml/2006/main">
+                  <a:graphicData uri="http://schemas.microsoft.com/office/word/2010/wordprocessingShape">
+                    <wps:wsp>
+                      <wps:cNvSpPr txBox="1">
+                        <a:spLocks noChangeArrowheads="1"/>
+                      </wps:cNvSpPr>
+                      <wps:spPr bwMode="auto">
+                        <a:xfrm flipH="1">
+                          <a:off x="0" y="0"/>
+                          <a:ext cx="1868170" cy="1266825"/>
+                        </a:xfrm>
+                        <a:prstGeom prst="rect">
+                          <a:avLst/>
+                        </a:prstGeom>
+                        <a:noFill/>
+                        <a:ln w="9525">
+                          <a:noFill/>
+                          <a:miter lim="800000"/>
+                          <a:headEnd/>
+                          <a:tailEnd/>
+                        </a:ln>
+                      </wps:spPr>
+                      <wps:txbx>
+                        <w:txbxContent>
+                          <w:p>
+                            <w:pPr>
+                              <w:rPr>
+                                <w:rFonts w:ascii="Helvetica Neue W23 for SKY Reg" w:hAnsi="Helvetica Neue W23 for SKY Reg"/>
+                                <w:b/>
+                                <w:bCs/>
+                                <w:sz w:val="24"/>
+                              </w:rPr>
+                            </w:pPr>
+                            <w:r>
+                              <w:rPr>
+                                <w:rFonts w:ascii="Helvetica Neue W23 for SKY Reg" w:hAnsi="Helvetica Neue W23 for SKY Reg"/>
+                                <w:b/>
+                                <w:bCs/>
+                                <w:sz w:val="24"/>
+                                <w:rtl/>
+                              </w:rPr>
+                              <w:t>{{</w:t>
+                            </w:r>
+                            <w:proofErr w:type="spellStart"/>
+                            <w:r>
+                              <w:rPr>
+                                <w:rFonts w:ascii="Helvetica Neue W23 for SKY Reg" w:hAnsi="Helvetica Neue W23 for SKY Reg"/>
+                                <w:b/>
+                                <w:bCs/>
+                                <w:sz w:val="24"/>
+                              </w:rPr>
+                              <w:t>signatureRightRole</w:t>
+                            </w:r>
+                            <w:proofErr w:type="spellEnd"/>
+                            <w:r>
+                              <w:rPr>
+                                <w:rFonts w:ascii="Helvetica Neue W23 for SKY Reg" w:hAnsi="Helvetica Neue W23 for SKY Reg"/>
+                                <w:b/>
+                                <w:bCs/>
+                                <w:sz w:val="24"/>
+                                <w:rtl/>
+                              </w:rPr>
+                              <w:t>}}</w:t>
+                            </w:r>
+                          </w:p>
+                          <w:p>
+                            <w:pPr>
+                              <w:rPr>
+                                <w:rFonts w:ascii="Helvetica Neue W23 for SKY Reg" w:hAnsi="Helvetica Neue W23 for SKY Reg"/>
+                                <w:b/>
+                                <w:bCs/>
+                                <w:sz w:val="24"/>
+                              </w:rPr>
+                            </w:pPr>
+                            <w:r>
+                              <w:rPr>
+                                <w:rFonts w:ascii="Helvetica Neue W23 for SKY Reg" w:hAnsi="Helvetica Neue W23 for SKY Reg"/>
+                                <w:b/>
+                                <w:bCs/>
+                                <w:sz w:val="24"/>
+                                <w:rtl/>
+                              </w:rPr>
+                              <w:t>{{</w:t>
+                            </w:r>
+                            <w:proofErr w:type="spellStart"/>
+                            <w:r>
+                              <w:rPr>
+                                <w:rFonts w:ascii="Helvetica Neue W23 for SKY Reg" w:hAnsi="Helvetica Neue W23 for SKY Reg"/>
+                                <w:b/>
+                                <w:bCs/>
+                                <w:sz w:val="24"/>
+                              </w:rPr>
+                              <w:t>signatureRightName</w:t>
+                            </w:r>
+                            <w:proofErr w:type="spellEnd"/>
+                            <w:r>
+                              <w:rPr>
+                                <w:rFonts w:ascii="Helvetica Neue W23 for SKY Reg" w:hAnsi="Helvetica Neue W23 for SKY Reg"/>
+                                <w:b/>
+                                <w:bCs/>
+                                <w:sz w:val="24"/>
+                                <w:rtl/>
+                              </w:rPr>
+                              <w:t>}}</w:t>
+                            </w:r>
+                          </w:p>
+                        </w:txbxContent>
+                      </wps:txbx>
+                      <wps:bodyPr rot="0" vert="horz" wrap="square" lIns="91440" tIns="45720" rIns="91440" bIns="45720" anchor="t" anchorCtr="0">
+                        <a:noAutofit/>
+                      </wps:bodyPr>
+                    </wps:wsp>
+                  </a:graphicData>
+                </a:graphic>
+                <wp14:sizeRelH relativeFrom="margin">
+                  <wp14:pctWidth>0</wp14:pctWidth>
+                </wp14:sizeRelH>
+                <wp14:sizeRelV relativeFrom="margin">
+                  <wp14:pctHeight>0</wp14:pctHeight>
+                </wp14:sizeRelV>
+              </wp:anchor>
+            </w:drawing>
+          </mc:Choice>
+          <mc:Fallback>
+            <w:pict>
+              <v:shapetype w14:anchorId="0831379A" id="_x0000_t202" coordsize="21600,21600" o:spt="202" path="m,l,21600r21600,l21600,xe">
+                <v:stroke joinstyle="miter"/>
+                <v:path gradientshapeok="t" o:connecttype="rect"/>
+              </v:shapetype>
+              <v:shape id="مربع نص 2" o:spid="_x0000_s1026" type="#_x0000_t202" style="position:absolute;left:0;text-align:left;margin-left:95.9pt;margin-top:99.7pt;width:147.1pt;height:99.75pt;flip:x;z-index:251659264;visibility:visible;mso-wrap-style:square;mso-width-percent:0;mso-height-percent:0;mso-wrap-distance-left:9pt;mso-wrap-distance-top:3.6pt;mso-wrap-distance-right:9pt;mso-wrap-distance-bottom:3.6pt;mso-position-horizontal:right;mso-position-horizontal-relative:margin;mso-position-vertical:absolute;mso-position-vertical-relative:text;mso-width-percent:0;mso-height-percent:0;mso-width-relative:margin;mso-height-relative:margin;v-text-anchor:top" o:gfxdata="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" filled="f" stroked="f">
+                <v:textbox>
+                  <w:txbxContent>
+                    <w:p>
+                      <w:pPr>
+                        <w:rPr>
+                          <w:rFonts w:ascii="Helvetica Neue W23 for SKY Reg" w:hAnsi="Helvetica Neue W23 for SKY Reg"/>
+                          <w:b/>
+                          <w:bCs/>
+                          <w:sz w:val="24"/>
+                        </w:rPr>
+                      </w:pPr>
+                      <w:r>
+                        <w:rPr>
+                          <w:rFonts w:ascii="Helvetica Neue W23 for SKY Reg" w:hAnsi="Helvetica Neue W23 for SKY Reg"/>
+                          <w:b/>
+                          <w:bCs/>
+                          <w:sz w:val="24"/>
+                          <w:rtl/>
+                        </w:rPr>
+                        <w:t>{{</w:t>
+                      </w:r>
+                      <w:proofErr w:type="spellStart"/>
+                      <w:r>
+                        <w:rPr>
+                          <w:rFonts w:ascii="Helvetica Neue W23 for SKY Reg" w:hAnsi="Helvetica Neue W23 for SKY Reg"/>
+                          <w:b/>
+                          <w:bCs/>
+                          <w:sz w:val="24"/>
+                        </w:rPr>
+                        <w:t>signatureRightRole</w:t>
+                      </w:r>
+                      <w:proofErr w:type="spellEnd"/>
+                      <w:r>
+                        <w:rPr>
+                          <w:rFonts w:ascii="Helvetica Neue W23 for SKY Reg" w:hAnsi="Helvetica Neue W23 for SKY Reg"/>
+                          <w:b/>
+                          <w:bCs/>
+                          <w:sz w:val="24"/>
+                          <w:rtl/>
+                        </w:rPr>
+                        <w:t>}}</w:t>
+                      </w:r>
+                    </w:p>
+                    <w:p>
+                      <w:pPr>
+                        <w:rPr>
+                          <w:rFonts w:ascii="Helvetica Neue W23 for SKY Reg" w:hAnsi="Helvetica Neue W23 for SKY Reg"/>
+                          <w:b/>
+                          <w:bCs/>
+                          <w:sz w:val="24"/>
+                        </w:rPr>
+                      </w:pPr>
+                      <w:r>
+                        <w:rPr>
+                          <w:rFonts w:ascii="Helvetica Neue W23 for SKY Reg" w:hAnsi="Helvetica Neue W23 for SKY Reg"/>
+                          <w:b/>
+                          <w:bCs/>
+                          <w:sz w:val="24"/>
+                          <w:rtl/>
+                        </w:rPr>
+                        <w:t>{{</w:t>
+                      </w:r>
+                      <w:proofErr w:type="spellStart"/>
+                      <w:r>
+                        <w:rPr>
+                          <w:rFonts w:ascii="Helvetica Neue W23 for SKY Reg" w:hAnsi="Helvetica Neue W23 for SKY Reg"/>
+                          <w:b/>
+                          <w:bCs/>
+                          <w:sz w:val="24"/>
+                        </w:rPr>
+                        <w:t>signatureRightName</w:t>
+                      </w:r>
+                      <w:proofErr w:type="spellEnd"/>
+                      <w:r>
+                        <w:rPr>
+                          <w:rFonts w:ascii="Helvetica Neue W23 for SKY Reg" w:hAnsi="Helvetica Neue W23 for SKY Reg"/>
+                          <w:b/>
+                          <w:bCs/>
+                          <w:sz w:val="24"/>
+                          <w:rtl/>
+                        </w:rPr>
+                        <w:t>}}</w:t>
+                      </w:r>
+                    </w:p>
+                  </w:txbxContent>
+                </v:textbox>
+                <w10:wrap type="square" anchorx="margin"/>
+              </v:shape>
+            </w:pict>
+          </mc:Fallback>
+        </mc:AlternateContent>
+      </w:r>
+      <w:r>
+        <w:rPr>
+          <w:noProof/>
+          <w:rtl/>
+        </w:rPr>
+        <mc:AlternateContent>
+          <mc:Choice Requires="wps">
+            <w:drawing>
+              <wp:anchor distT="45720" distB="45720" distL="114300" distR="114300" simplePos="0" relativeHeight="251661312" behindDoc="0" locked="0" layoutInCell="1" allowOverlap="1" wp14:anchorId="4D0DA98A" wp14:editId="077009F6">
+                <wp:simplePos x="0" y="0"/>
+                <wp:positionH relativeFrom="margin">
+                  <wp:align>left</wp:align>
+                </wp:positionH>
+                <wp:positionV relativeFrom="paragraph">
+                  <wp:posOffset>1266190</wp:posOffset>
+                </wp:positionV>
+                <wp:extent cx="1868400" cy="1266825"/>
+                <wp:effectExtent l="0" t="0" r="0" b="0"/>
+                <wp:wrapSquare wrapText="bothSides"/>
+                <wp:docPr id="1154875674" name="مربع نص 2"/>
+                <wp:cNvGraphicFramePr>
+                  <a:graphicFrameLocks xmlns:a="http://schemas.openxmlformats.org/drawingml/2006/main"/>
+                </wp:cNvGraphicFramePr>
+                <a:graphic xmlns:a="http://schemas.openxmlformats.org/drawingml/2006/main">
+                  <a:graphicData uri="http://schemas.microsoft.com/office/word/2010/wordprocessingShape">
+                    <wps:wsp>
+                      <wps:cNvSpPr txBox="1">
+                        <a:spLocks noChangeArrowheads="1"/>
+                      </wps:cNvSpPr>
+                      <wps:spPr bwMode="auto">
+                        <a:xfrm flipH="1">
+                          <a:off x="0" y="0"/>
+                          <a:ext cx="1868400" cy="1266825"/>
+                        </a:xfrm>
+                        <a:prstGeom prst="rect">
+                          <a:avLst/>
+                        </a:prstGeom>
+                        <a:noFill/>
+                        <a:ln w="9525">
+                          <a:noFill/>
+                          <a:miter lim="800000"/>
+                          <a:headEnd/>
+                          <a:tailEnd/>
+                        </a:ln>
+                      </wps:spPr>
+                      <wps:txbx>
+                        <w:txbxContent>
+                          <w:p>
+                            <w:pPr>
+                              <w:rPr>
+                                <w:rFonts w:ascii="Helvetica Neue W23 for SKY Reg" w:hAnsi="Helvetica Neue W23 for SKY Reg"/>
+                                <w:b/>
+                                <w:bCs/>
+                                <w:sz w:val="24"/>
+                                <w:rtl/>
+                              </w:rPr>
+                            </w:pPr>
+                            <w:r>
+                              <w:rPr>
+                                <w:rFonts w:ascii="Helvetica Neue W23 for SKY Reg" w:hAnsi="Helvetica Neue W23 for SKY Reg"/>
+                                <w:b/>
+                                <w:bCs/>
+                                <w:sz w:val="24"/>
+                              </w:rPr>
+                              <w:t>{{</w:t>
+                            </w:r>
+                            <w:proofErr w:type="spellStart"/>
+                            <w:r>
+                              <w:rPr>
+                                <w:rFonts w:ascii="Helvetica Neue W23 for SKY Reg" w:hAnsi="Helvetica Neue W23 for SKY Reg"/>
+                                <w:b/>
+                                <w:bCs/>
+                                <w:sz w:val="24"/>
+                              </w:rPr>
+                              <w:t>signatureLeftRole</w:t>
+                            </w:r>
+                            <w:proofErr w:type="spellEnd"/>
+                            <w:r>
+                              <w:rPr>
+                                <w:rFonts w:ascii="Helvetica Neue W23 for SKY Reg" w:hAnsi="Helvetica Neue W23 for SKY Reg"/>
+                                <w:b/>
+                                <w:bCs/>
+                                <w:sz w:val="24"/>
+                              </w:rPr>
+                              <w:t>}} {{</w:t>
+                            </w:r>
+                            <w:proofErr w:type="spellStart"/>
+                            <w:r>
+                              <w:rPr>
+                                <w:rFonts w:ascii="Helvetica Neue W23 for SKY Reg" w:hAnsi="Helvetica Neue W23 for SKY Reg"/>
+                                <w:b/>
+                                <w:bCs/>
+                                <w:sz w:val="24"/>
+                              </w:rPr>
+                              <w:t>sig</w:t>
+                            </w:r>
+                            <w:r>
+                              <w:rPr>
+                                <w:rFonts w:ascii="Helvetica Neue W23 for SKY Reg" w:hAnsi="Helvetica Neue W23 for SKY Reg"/>
+                                <w:b/>
+                                <w:bCs/>
+                                <w:sz w:val="24"/>
+                              </w:rPr>
+                              <w:t>'</w:t>
+                            </w:r>
+                            <w:r>
+                              <w:rPr>
+                                <w:rFonts w:ascii="Helvetica Neue W23 for SKY Reg" w:hAnsi="Helvetica Neue W23 for SKY Reg"/>
+                                <w:b/>
+                                <w:bCs/>
+                                <w:sz w:val="24"/>
+                              </w:rPr>
+                              <w:t>natureLeftName</w:t>
+                            </w:r>
+                            <w:proofErr w:type="spellEnd"/>
+                            <w:r>
+                              <w:rPr>
+                                <w:rFonts w:ascii="Helvetica Neue W23 for SKY Reg" w:hAnsi="Helvetica Neue W23 for SKY Reg"/>
+                                <w:b/>
+                                <w:bCs/>
+                                <w:sz w:val="24"/>
+                              </w:rPr>
+                              <w:t>}}</w:t>
+                            </w:r>
+                          </w:p>
+                        </w:txbxContent>
+                      </wps:txbx>
+                      <wps:bodyPr rot="0" vert="horz" wrap="square" lIns="91440" tIns="45720" rIns="91440" bIns="45720" anchor="t" anchorCtr="0">
+                        <a:noAutofit/>
+                      </wps:bodyPr>
+                    </wps:wsp>
+                  </a:graphicData>
+                </a:graphic>
+                <wp14:sizeRelH relativeFrom="margin">
+                  <wp14:pctWidth>0</wp14:pctWidth>
+                </wp14:sizeRelH>
+                <wp14:sizeRelV relativeFrom="margin">
+                  <wp14:pctHeight>0</wp14:pctHeight>
+                </wp14:sizeRelV>
+              </wp:anchor>
+            </w:drawing>
+          </mc:Choice>
+          <mc:Fallback>
+            <w:pict>
+              <v:shape w14:anchorId="4D0DA98A" id="_x0000_s1027" type="#_x0000_t202" style="position:absolute;left:0;text-align:left;margin-left:0;margin-top:99.7pt;width:147.1pt;height:99.75pt;flip:x;z-index:251661312;visibility:visible;mso-wrap-style:square;mso-width-percent:0;mso-height-percent:0;mso-wrap-distance-left:9pt;mso-wrap-distance-top:3.6pt;mso-wrap-distance-right:9pt;mso-wrap-distance-bottom:3.6pt;mso-position-horizontal:left;mso-position-horizontal-relative:margin;mso-position-vertical:absolute;mso-position-vertical-relative:text;mso-width-percent:0;mso-height-percent:0;mso-width-relative:margin;mso-height-relative:margin;v-text-anchor:top" o:gfxdata="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" filled="f" stroked="f">
+                <v:textbox>
+                  <w:txbxContent>
+                    <w:p>
+                      <w:pPr>
+                        <w:rPr>
+                          <w:rFonts w:ascii="Helvetica Neue W23 for SKY Reg" w:hAnsi="Helvetica Neue W23 for SKY Reg"/>
+                          <w:b/>
+                          <w:bCs/>
+                          <w:sz w:val="24"/>
+                          <w:rtl/>
+                        </w:rPr>
+                      </w:pPr>
+                      <w:r>
+                        <w:rPr>
+                          <w:rFonts w:ascii="Helvetica Neue W23 for SKY Reg" w:hAnsi="Helvetica Neue W23 for SKY Reg"/>
+                          <w:b/>
+                          <w:bCs/>
+                          <w:sz w:val="24"/>
+                        </w:rPr>
+                        <w:t>{{</w:t>
+                      </w:r>
+                      <w:proofErr w:type="spellStart"/>
+                      <w:r>
+                        <w:rPr>
+                          <w:rFonts w:ascii="Helvetica Neue W23 for SKY Reg" w:hAnsi="Helvetica Neue W23 for SKY Reg"/>
+                          <w:b/>
+                          <w:bCs/>
+                          <w:sz w:val="24"/>
+                        </w:rPr>
+                        <w:t>signatureLeftRole</w:t>
+                      </w:r>
+                      <w:proofErr w:type="spellEnd"/>
+                      <w:r>
+                        <w:rPr>
+                          <w:rFonts w:ascii="Helvetica Neue W23 for SKY Reg" w:hAnsi="Helvetica Neue W23 for SKY Reg"/>
+                          <w:b/>
+                          <w:bCs/>
+                          <w:sz w:val="24"/>
+                        </w:rPr>
+                        <w:t>}} {{</w:t>
+                      </w:r>
+                      <w:proofErr w:type="spellStart"/>
+                      <w:r>
+                        <w:rPr>
+                          <w:rFonts w:ascii="Helvetica Neue W23 for SKY Reg" w:hAnsi="Helvetica Neue W23 for SKY Reg"/>
+                          <w:b/>
+                          <w:bCs/>
+                          <w:sz w:val="24"/>
+                        </w:rPr>
+                        <w:t>sig</w:t>
+                      </w:r>
+                      <w:r>
+                        <w:rPr>
+                          <w:rFonts w:ascii="Helvetica Neue W23 for SKY Reg" w:hAnsi="Helvetica Neue W23 for SKY Reg"/>
+                          <w:b/>
+                          <w:bCs/>
+                          <w:sz w:val="24"/>
+                        </w:rPr>
+                        <w:t>'</w:t>
+                      </w:r>
+                      <w:r>
+                        <w:rPr>
+                          <w:rFonts w:ascii="Helvetica Neue W23 for SKY Reg" w:hAnsi="Helvetica Neue W23 for SKY Reg"/>
+                          <w:b/>
+                          <w:bCs/>
+                          <w:sz w:val="24"/>
+                        </w:rPr>
+                        <w:t>natureLeftName</w:t>
+                      </w:r>
+                      <w:proofErr w:type="spellEnd"/>
+                      <w:r>
+                        <w:rPr>
+                          <w:rFonts w:ascii="Helvetica Neue W23 for SKY Reg" w:hAnsi="Helvetica Neue W23 for SKY Reg"/>
+                          <w:b/>
+                          <w:bCs/>
+                          <w:sz w:val="24"/>
+                        </w:rPr>
+                        <w:t>}}</w:t>
+                      </w:r>
+                    </w:p>
+                  </w:txbxContent>
+                </v:textbox>
+                <w10:wrap type="square" anchorx="margin"/>
+              </v:shape>
+            </w:pict>
+          </mc:Fallback>
+        </mc:AlternateContent>
+      </w:r>
     </w:p>
-    <w:p>
-      <w:pPr>
-        <w:rPr>
-          <w:rtl/>
-        </w:rPr>
-      </w:pPr>
-    </w:p>
-    <w:p/>
-    <w:p>
-      <w:pPr>
-        <w:rPr>
-          <w:rtl/>
-        </w:rPr>
-      </w:pPr>
-      <w:r>
-        <w:rPr>
-          <w:rFonts w:hint="cs"/>
-          <w:rtl/>
-        </w:rPr>
-        <w:t>اسم</w:t>
-      </w:r>
-      <w:r>
-        <w:rPr>
-          <w:rtl/>
-        </w:rPr>
-        <w:t xml:space="preserve"> </w:t>
-      </w:r>
-      <w:r>
-        <w:rPr>
-          <w:rFonts w:hint="cs"/>
-          <w:rtl/>
-        </w:rPr>
-        <w:t>المكلف</w:t>
-      </w:r>
-      <w:r>
-        <w:rPr>
-          <w:rtl/>
-        </w:rPr>
-        <w:t xml:space="preserve">:  .........................................................                                     </w:t>
-      </w:r>
-      <w:r>
-        <w:rPr>
-          <w:rFonts w:hint="cs"/>
-          <w:rtl/>
-        </w:rPr>
-        <w:t>مدير</w:t>
-      </w:r>
-      <w:r>
-        <w:rPr>
-          <w:rtl/>
-        </w:rPr>
-        <w:t xml:space="preserve"> </w:t>
-      </w:r>
-      <w:r>
-        <w:rPr>
-          <w:rFonts w:hint="cs"/>
-          <w:rtl/>
-        </w:rPr>
-        <w:t>المدرسة</w:t>
-      </w:r>
-      <w:r>
-        <w:rPr>
-          <w:rtl/>
-        </w:rPr>
-        <w:t xml:space="preserve">                                                                                  </w:t>
-      </w:r>
-    </w:p>
-    <w:p>
-      <w:pPr>
-        <w:rPr>
-          <w:rtl/>
-        </w:rPr>
-      </w:pPr>
-      <w:r>
-        <w:rPr>
-          <w:rFonts w:hint="cs"/>
-          <w:rtl/>
-        </w:rPr>
-        <w:t>التوقيـــــع</w:t>
-      </w:r>
-      <w:r>
-        <w:rPr>
-          <w:rtl/>
-        </w:rPr>
-        <w:t xml:space="preserve">: ............................................................. </w:t>
-      </w:r>
-      <w:r>
-        <w:rPr>
-          <w:rtl/>
-        </w:rPr>
-        <w:tab/>
-      </w:r>
-      <w:r>
-        <w:rPr>
-          <w:rtl/>
-        </w:rPr>
-        <w:tab/>
-        <w:t xml:space="preserve"> </w:t>
-      </w:r>
-      <w:r>
-        <w:rPr>
-          <w:rtl/>
-        </w:rPr>
-        <w:tab/>
-        <w:t xml:space="preserve"> </w:t>
-      </w:r>
-      <w:r>
-        <w:rPr>
-          <w:rtl/>
-        </w:rPr>
-        <w:tab/>
-        <w:t xml:space="preserve"> </w:t>
-      </w:r>
-      <w:r>
-        <w:rPr>
-          <w:rtl/>
-        </w:rPr>
-        <w:tab/>
-        <w:t xml:space="preserve"> </w:t>
-      </w:r>
-    </w:p>
-    <w:p/>
     <w:sectPr>
       <w:headerReference w:type="default" r:id="rId8"/>
       <w:footerReference w:type="default" r:id="rId9"/>
@@ -1801,7 +2214,7 @@
       <mc:AlternateContent>
         <mc:Choice Requires="wps">
           <w:drawing>
-            <wp:anchor distT="0" distB="0" distL="114300" distR="114300" simplePos="0" relativeHeight="251657216" behindDoc="0" locked="0" layoutInCell="1" allowOverlap="1" wp14:anchorId="013D7D1B" wp14:editId="2EF537A5">
+            <wp:anchor distT="0" distB="0" distL="114300" distR="114300" simplePos="0" relativeHeight="251657216" behindDoc="0" locked="0" layoutInCell="1" allowOverlap="1" wp14:anchorId="013D7D1B" wp14:editId="0C69BA25">
               <wp:simplePos x="0" y="0"/>
               <wp:positionH relativeFrom="column">
                 <wp:posOffset>-1029335</wp:posOffset>
@@ -1870,7 +2283,7 @@
         </mc:Choice>
         <mc:Fallback>
           <w:pict>
-            <v:roundrect w14:anchorId="0D37749C" id="مستطيل: زوايا مستديرة 10" o:spid="_x0000_s1026" style="position:absolute;left:0;text-align:left;margin-left:-81.05pt;margin-top:17.45pt;width:537pt;height:45.5pt;z-index:251663360;visibility:visible;mso-wrap-style:square;mso-height-percent:0;mso-wrap-distance-left:9pt;mso-wrap-distance-top:0;mso-wrap-distance-right:9pt;mso-wrap-distance-bottom:0;mso-position-horizontal:absolute;mso-position-horizontal-relative:text;mso-position-vertical:absolute;mso-position-vertical-relative:text;mso-height-percent:0;mso-height-relative:margin;v-text-anchor:middle" arcsize=".5" o:gfxdata="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" fillcolor="white [3212]" strokecolor="#3d7eb9" strokeweight="1.5pt">
+            <v:roundrect w14:anchorId="5051A381" id="مستطيل: زوايا مستديرة 10" o:spid="_x0000_s1026" style="position:absolute;left:0;text-align:left;margin-left:-81.05pt;margin-top:17.45pt;width:537pt;height:45.5pt;z-index:251657216;visibility:visible;mso-wrap-style:square;mso-height-percent:0;mso-wrap-distance-left:9pt;mso-wrap-distance-top:0;mso-wrap-distance-right:9pt;mso-wrap-distance-bottom:0;mso-position-horizontal:absolute;mso-position-horizontal-relative:text;mso-position-vertical:absolute;mso-position-vertical-relative:text;mso-height-percent:0;mso-height-relative:margin;v-text-anchor:middle" arcsize=".5" o:gfxdata="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" fillcolor="white [3212]" strokecolor="#3d7eb9" strokeweight="1.5pt">
               <v:stroke joinstyle="miter"/>
             </v:roundrect>
           </w:pict>
@@ -1880,142 +2293,9 @@
     <w:r>
       <w:rPr>
         <w:noProof/>
-        <w:rtl/>
-      </w:rPr>
-      <mc:AlternateContent>
-        <mc:Choice Requires="wps">
-          <w:drawing>
-            <wp:anchor distT="45720" distB="45720" distL="114300" distR="114300" simplePos="0" relativeHeight="251659264" behindDoc="0" locked="0" layoutInCell="1" allowOverlap="1" wp14:anchorId="0E7082BF" wp14:editId="0DF68588">
-              <wp:simplePos x="0" y="0"/>
-              <wp:positionH relativeFrom="margin">
-                <wp:align>center</wp:align>
-              </wp:positionH>
-              <wp:positionV relativeFrom="paragraph">
-                <wp:posOffset>558165</wp:posOffset>
-              </wp:positionV>
-              <wp:extent cx="4432300" cy="476250"/>
-              <wp:effectExtent l="0" t="0" r="0" b="0"/>
-              <wp:wrapSquare wrapText="bothSides"/>
-              <wp:docPr id="217" name="مربع نص 2"/>
-              <wp:cNvGraphicFramePr>
-                <a:graphicFrameLocks xmlns:a="http://schemas.openxmlformats.org/drawingml/2006/main"/>
-              </wp:cNvGraphicFramePr>
-              <a:graphic xmlns:a="http://schemas.openxmlformats.org/drawingml/2006/main">
-                <a:graphicData uri="http://schemas.microsoft.com/office/word/2010/wordprocessingShape">
-                  <wps:wsp>
-                    <wps:cNvSpPr txBox="1">
-                      <a:spLocks noChangeArrowheads="1"/>
-                    </wps:cNvSpPr>
-                    <wps:spPr bwMode="auto">
-                      <a:xfrm flipH="1">
-                        <a:off x="0" y="0"/>
-                        <a:ext cx="4432300" cy="476250"/>
-                      </a:xfrm>
-                      <a:prstGeom prst="rect">
-                        <a:avLst/>
-                      </a:prstGeom>
-                      <a:noFill/>
-                      <a:ln w="9525">
-                        <a:noFill/>
-                        <a:miter lim="800000"/>
-                        <a:headEnd/>
-                        <a:tailEnd/>
-                      </a:ln>
-                    </wps:spPr>
-                    <wps:txbx>
-                      <w:txbxContent>
-                        <w:p>
-                          <w:pPr>
-                            <w:jc w:val="center"/>
-                            <w:rPr>
-                              <w:rFonts w:ascii="Helvetica Neue W23 for SKY Reg" w:hAnsi="Helvetica Neue W23 for SKY Reg"/>
-                              <w:color w:val="FFFFFF" w:themeColor="background1"/>
-                              <w:rtl/>
-                            </w:rPr>
-                          </w:pPr>
-                          <w:r>
-                            <w:rPr>
-                              <w:rFonts w:ascii="Helvetica Neue W23 for SKY Reg" w:hAnsi="Helvetica Neue W23 for SKY Reg"/>
-                              <w:color w:val="FFFFFF" w:themeColor="background1"/>
-                              <w:rtl/>
-                            </w:rPr>
-                            <w:t xml:space="preserve">تشكيل لجنة التحصيل الدراسي </w:t>
-                          </w:r>
-                          <w:r>
-                            <w:rPr>
-                              <w:rFonts w:ascii="Helvetica Neue W23 for SKY Reg" w:hAnsi="Helvetica Neue W23 for SKY Reg" w:hint="cs"/>
-                              <w:color w:val="FFFFFF" w:themeColor="background1"/>
-                              <w:rtl/>
-                            </w:rPr>
-                            <w:t xml:space="preserve">للعام 1448 هـ </w:t>
-                          </w:r>
-                        </w:p>
-                      </w:txbxContent>
-                    </wps:txbx>
-                    <wps:bodyPr rot="0" vert="horz" wrap="square" lIns="91440" tIns="45720" rIns="91440" bIns="45720" anchor="t" anchorCtr="0">
-                      <a:noAutofit/>
-                    </wps:bodyPr>
-                  </wps:wsp>
-                </a:graphicData>
-              </a:graphic>
-              <wp14:sizeRelH relativeFrom="margin">
-                <wp14:pctWidth>0</wp14:pctWidth>
-              </wp14:sizeRelH>
-              <wp14:sizeRelV relativeFrom="margin">
-                <wp14:pctHeight>0</wp14:pctHeight>
-              </wp14:sizeRelV>
-            </wp:anchor>
-          </w:drawing>
-        </mc:Choice>
-        <mc:Fallback>
-          <w:pict>
-            <v:shapetype w14:anchorId="0E7082BF" id="_x0000_t202" coordsize="21600,21600" o:spt="202" path="m,l,21600r21600,l21600,xe">
-              <v:stroke joinstyle="miter"/>
-              <v:path gradientshapeok="t" o:connecttype="rect"/>
-            </v:shapetype>
-            <v:shape id="مربع نص 2" o:spid="_x0000_s1028" type="#_x0000_t202" style="position:absolute;left:0;text-align:left;margin-left:0;margin-top:43.95pt;width:349pt;height:37.5pt;flip:x;z-index:251659264;visibility:visible;mso-wrap-style:square;mso-width-percent:0;mso-height-percent:0;mso-wrap-distance-left:9pt;mso-wrap-distance-top:3.6pt;mso-wrap-distance-right:9pt;mso-wrap-distance-bottom:3.6pt;mso-position-horizontal:center;mso-position-horizontal-relative:margin;mso-position-vertical:absolute;mso-position-vertical-relative:text;mso-width-percent:0;mso-height-percent:0;mso-width-relative:margin;mso-height-relative:margin;v-text-anchor:top" o:gfxdata="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" filled="f" stroked="f">
-              <v:textbox>
-                <w:txbxContent>
-                  <w:p>
-                    <w:pPr>
-                      <w:jc w:val="center"/>
-                      <w:rPr>
-                        <w:rFonts w:ascii="Helvetica Neue W23 for SKY Reg" w:hAnsi="Helvetica Neue W23 for SKY Reg"/>
-                        <w:color w:val="FFFFFF" w:themeColor="background1"/>
-                        <w:rtl/>
-                      </w:rPr>
-                    </w:pPr>
-                    <w:r>
-                      <w:rPr>
-                        <w:rFonts w:ascii="Helvetica Neue W23 for SKY Reg" w:hAnsi="Helvetica Neue W23 for SKY Reg"/>
-                        <w:color w:val="FFFFFF" w:themeColor="background1"/>
-                        <w:rtl/>
-                      </w:rPr>
-                      <w:t xml:space="preserve">تشكيل لجنة التحصيل الدراسي </w:t>
-                    </w:r>
-                    <w:r>
-                      <w:rPr>
-                        <w:rFonts w:ascii="Helvetica Neue W23 for SKY Reg" w:hAnsi="Helvetica Neue W23 for SKY Reg" w:hint="cs"/>
-                        <w:color w:val="FFFFFF" w:themeColor="background1"/>
-                        <w:rtl/>
-                      </w:rPr>
-                      <w:t xml:space="preserve">للعام 1448 هـ </w:t>
-                    </w:r>
-                  </w:p>
-                </w:txbxContent>
-              </v:textbox>
-              <w10:wrap type="square" anchorx="margin"/>
-            </v:shape>
-          </w:pict>
-        </mc:Fallback>
-      </mc:AlternateContent>
-    </w:r>
-    <w:r>
-      <w:rPr>
-        <w:noProof/>
       </w:rPr>
       <w:drawing>
-        <wp:anchor distT="0" distB="0" distL="114300" distR="114300" simplePos="0" relativeHeight="251658240" behindDoc="0" locked="0" layoutInCell="1" allowOverlap="1" wp14:anchorId="7EAFD756" wp14:editId="3AE4E904">
+        <wp:anchor distT="0" distB="0" distL="114300" distR="114300" simplePos="0" relativeHeight="251658240" behindDoc="0" locked="0" layoutInCell="1" allowOverlap="1" wp14:anchorId="7EAFD756" wp14:editId="1BD6B742">
           <wp:simplePos x="0" y="0"/>
           <wp:positionH relativeFrom="margin">
             <wp:align>center</wp:align>
@@ -2083,26 +2363,18 @@
       <mc:AlternateContent>
         <mc:Choice Requires="wps">
           <w:drawing>
-            <wp:anchor distT="45720" distB="45720" distL="114300" distR="114300" simplePos="0" relativeHeight="251661312" behindDoc="1" locked="0" layoutInCell="1" allowOverlap="1" wp14:anchorId="2E741FF7" wp14:editId="5ADEA0EA">
+            <wp:anchor distT="45720" distB="45720" distL="114300" distR="114300" simplePos="0" relativeHeight="251659264" behindDoc="0" locked="0" layoutInCell="1" allowOverlap="1" wp14:anchorId="0E7082BF" wp14:editId="6E5FDA50">
               <wp:simplePos x="0" y="0"/>
-              <wp:positionH relativeFrom="column">
-                <wp:posOffset>-1314450</wp:posOffset>
+              <wp:positionH relativeFrom="margin">
+                <wp:align>center</wp:align>
               </wp:positionH>
               <wp:positionV relativeFrom="paragraph">
-                <wp:posOffset>241935</wp:posOffset>
+                <wp:posOffset>143510</wp:posOffset>
               </wp:positionV>
-              <wp:extent cx="2360930" cy="499110"/>
+              <wp:extent cx="4432300" cy="476250"/>
               <wp:effectExtent l="0" t="0" r="0" b="0"/>
-              <wp:wrapTight wrapText="bothSides">
-                <wp:wrapPolygon edited="0">
-                  <wp:start x="536" y="0"/>
-                  <wp:lineTo x="536" y="20611"/>
-                  <wp:lineTo x="20897" y="20611"/>
-                  <wp:lineTo x="20897" y="0"/>
-                  <wp:lineTo x="536" y="0"/>
-                </wp:wrapPolygon>
-              </wp:wrapTight>
-              <wp:docPr id="2131893608" name="Left Signature"/>
+              <wp:wrapSquare wrapText="bothSides"/>
+              <wp:docPr id="217" name="مربع نص 2"/>
               <wp:cNvGraphicFramePr>
                 <a:graphicFrameLocks xmlns:a="http://schemas.openxmlformats.org/drawingml/2006/main"/>
               </wp:cNvGraphicFramePr>
@@ -2115,7 +2387,7 @@
                     <wps:spPr bwMode="auto">
                       <a:xfrm flipH="1">
                         <a:off x="0" y="0"/>
-                        <a:ext cx="2360930" cy="499110"/>
+                        <a:ext cx="4432300" cy="476250"/>
                       </a:xfrm>
                       <a:prstGeom prst="rect">
                         <a:avLst/>
@@ -2135,51 +2407,61 @@
                             <w:jc w:val="center"/>
                             <w:rPr>
                               <w:rFonts w:ascii="Helvetica Neue W23 for SKY Reg" w:hAnsi="Helvetica Neue W23 for SKY Reg"/>
+                              <w:b/>
+                              <w:bCs/>
                               <w:color w:val="FFFFFF" w:themeColor="background1"/>
+                              <w:sz w:val="24"/>
+                              <w:szCs w:val="28"/>
+                              <w:rtl/>
                             </w:rPr>
                           </w:pPr>
                           <w:r>
                             <w:rPr>
                               <w:rFonts w:ascii="Helvetica Neue W23 for SKY Reg" w:hAnsi="Helvetica Neue W23 for SKY Reg"/>
+                              <w:b/>
+                              <w:bCs/>
                               <w:color w:val="FFFFFF" w:themeColor="background1"/>
+                              <w:sz w:val="24"/>
+                              <w:szCs w:val="28"/>
                               <w:rtl/>
                             </w:rPr>
-                            <w:t>{{</w:t>
+                            <w:t xml:space="preserve">تشكيل لجنة التحصيل الدراسي </w:t>
                           </w:r>
-                          <w:proofErr w:type="spellStart"/>
                           <w:r>
                             <w:rPr>
-                              <w:rFonts w:ascii="Helvetica Neue W23 for SKY Reg" w:hAnsi="Helvetica Neue W23 for SKY Reg"/>
+                              <w:rFonts w:ascii="Helvetica Neue W23 for SKY Reg" w:hAnsi="Helvetica Neue W23 for SKY Reg" w:hint="cs"/>
+                              <w:b/>
+                              <w:bCs/>
                               <w:color w:val="FFFFFF" w:themeColor="background1"/>
+                              <w:sz w:val="24"/>
+                              <w:szCs w:val="28"/>
                               <w:rtl/>
                             </w:rPr>
-                            <w:t>signatureLeftRole</w:t>
+                            <w:t xml:space="preserve">للعام </w:t>
                           </w:r>
-                          <w:proofErr w:type="spellEnd"/>
                           <w:r>
                             <w:rPr>
-                              <w:rFonts w:ascii="Helvetica Neue W23 for SKY Reg" w:hAnsi="Helvetica Neue W23 for SKY Reg"/>
+                              <w:rFonts w:ascii="Helvetica Neue W23 for SKY Reg" w:hAnsi="Helvetica Neue W23 for SKY Reg" w:hint="cs"/>
+                              <w:b/>
+                              <w:bCs/>
                               <w:color w:val="FFFFFF" w:themeColor="background1"/>
+                              <w:sz w:val="24"/>
+                              <w:szCs w:val="28"/>
                               <w:rtl/>
                             </w:rPr>
-                            <w:t>}}</w:t>
+                            <w:t xml:space="preserve"> </w:t>
                           </w:r>
-                        </w:p>
-                        <w:p>
-                          <w:pPr>
-                            <w:jc w:val="center"/>
-                            <w:rPr>
-                              <w:rFonts w:ascii="Helvetica Neue W23 for SKY Reg" w:hAnsi="Helvetica Neue W23 for SKY Reg"/>
-                              <w:color w:val="FFFFFF" w:themeColor="background1"/>
-                            </w:rPr>
-                          </w:pPr>
                           <w:r>
                             <w:rPr>
-                              <w:rFonts w:ascii="Helvetica Neue W23 for SKY Reg" w:hAnsi="Helvetica Neue W23 for SKY Reg"/>
+                              <w:rFonts w:ascii="Helvetica Neue W23 for SKY Reg" w:hAnsi="Helvetica Neue W23 for SKY Reg" w:hint="cs"/>
+                              <w:b/>
+                              <w:bCs/>
                               <w:color w:val="FFFFFF" w:themeColor="background1"/>
+                              <w:sz w:val="24"/>
+                              <w:szCs w:val="28"/>
                               <w:rtl/>
                             </w:rPr>
-                            <w:t>{{signatureLeftName}}</w:t>
+                            <w:t xml:space="preserve">1448 هـ </w:t>
                           </w:r>
                         </w:p>
                       </w:txbxContent>
@@ -2191,7 +2473,7 @@
                 </a:graphicData>
               </a:graphic>
               <wp14:sizeRelH relativeFrom="margin">
-                <wp14:pctWidth>40000</wp14:pctWidth>
+                <wp14:pctWidth>0</wp14:pctWidth>
               </wp14:sizeRelH>
               <wp14:sizeRelV relativeFrom="margin">
                 <wp14:pctHeight>0</wp14:pctHeight>
@@ -2201,7 +2483,11 @@
         </mc:Choice>
         <mc:Fallback>
           <w:pict>
-            <v:shape w14:anchorId="2E741FF7" id="Left Signature" o:spid="_x0000_s1029" type="#_x0000_t202" style="position:absolute;left:0;text-align:left;margin-left:-103.5pt;margin-top:19.05pt;width:185.9pt;height:39.3pt;flip:x;z-index:-251655168;visibility:visible;mso-wrap-style:square;mso-width-percent:400;mso-height-percent:0;mso-wrap-distance-left:9pt;mso-wrap-distance-top:3.6pt;mso-wrap-distance-right:9pt;mso-wrap-distance-bottom:3.6pt;mso-position-horizontal:absolute;mso-position-horizontal-relative:text;mso-position-vertical:absolute;mso-position-vertical-relative:text;mso-width-percent:400;mso-height-percent:0;mso-width-relative:margin;mso-height-relative:margin;v-text-anchor:top" o:gfxdata="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" filled="f" stroked="f">
+            <v:shapetype w14:anchorId="0E7082BF" id="_x0000_t202" coordsize="21600,21600" o:spt="202" path="m,l,21600r21600,l21600,xe">
+              <v:stroke joinstyle="miter"/>
+              <v:path gradientshapeok="t" o:connecttype="rect"/>
+            </v:shapetype>
+            <v:shape id="_x0000_s1030" type="#_x0000_t202" style="position:absolute;left:0;text-align:left;margin-left:0;margin-top:11.3pt;width:349pt;height:37.5pt;flip:x;z-index:251659264;visibility:visible;mso-wrap-style:square;mso-width-percent:0;mso-height-percent:0;mso-wrap-distance-left:9pt;mso-wrap-distance-top:3.6pt;mso-wrap-distance-right:9pt;mso-wrap-distance-bottom:3.6pt;mso-position-horizontal:center;mso-position-horizontal-relative:margin;mso-position-vertical:absolute;mso-position-vertical-relative:text;mso-width-percent:0;mso-height-percent:0;mso-width-relative:margin;mso-height-relative:margin;v-text-anchor:top" o:gfxdata="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" filled="f" stroked="f">
               <v:textbox>
                 <w:txbxContent>
                   <w:p>
@@ -2209,209 +2495,66 @@
                       <w:jc w:val="center"/>
                       <w:rPr>
                         <w:rFonts w:ascii="Helvetica Neue W23 for SKY Reg" w:hAnsi="Helvetica Neue W23 for SKY Reg"/>
+                        <w:b/>
+                        <w:bCs/>
                         <w:color w:val="FFFFFF" w:themeColor="background1"/>
+                        <w:sz w:val="24"/>
+                        <w:szCs w:val="28"/>
+                        <w:rtl/>
                       </w:rPr>
                     </w:pPr>
                     <w:r>
                       <w:rPr>
                         <w:rFonts w:ascii="Helvetica Neue W23 for SKY Reg" w:hAnsi="Helvetica Neue W23 for SKY Reg"/>
+                        <w:b/>
+                        <w:bCs/>
                         <w:color w:val="FFFFFF" w:themeColor="background1"/>
+                        <w:sz w:val="24"/>
+                        <w:szCs w:val="28"/>
                         <w:rtl/>
                       </w:rPr>
-                      <w:t>{{</w:t>
+                      <w:t xml:space="preserve">تشكيل لجنة التحصيل الدراسي </w:t>
                     </w:r>
-                    <w:proofErr w:type="spellStart"/>
                     <w:r>
                       <w:rPr>
-                        <w:rFonts w:ascii="Helvetica Neue W23 for SKY Reg" w:hAnsi="Helvetica Neue W23 for SKY Reg"/>
+                        <w:rFonts w:ascii="Helvetica Neue W23 for SKY Reg" w:hAnsi="Helvetica Neue W23 for SKY Reg" w:hint="cs"/>
+                        <w:b/>
+                        <w:bCs/>
                         <w:color w:val="FFFFFF" w:themeColor="background1"/>
+                        <w:sz w:val="24"/>
+                        <w:szCs w:val="28"/>
                         <w:rtl/>
                       </w:rPr>
-                      <w:t>signatureLeftRole</w:t>
+                      <w:t xml:space="preserve">للعام </w:t>
                     </w:r>
-                    <w:proofErr w:type="spellEnd"/>
                     <w:r>
                       <w:rPr>
-                        <w:rFonts w:ascii="Helvetica Neue W23 for SKY Reg" w:hAnsi="Helvetica Neue W23 for SKY Reg"/>
+                        <w:rFonts w:ascii="Helvetica Neue W23 for SKY Reg" w:hAnsi="Helvetica Neue W23 for SKY Reg" w:hint="cs"/>
+                        <w:b/>
+                        <w:bCs/>
                         <w:color w:val="FFFFFF" w:themeColor="background1"/>
+                        <w:sz w:val="24"/>
+                        <w:szCs w:val="28"/>
                         <w:rtl/>
                       </w:rPr>
-                      <w:t>}}</w:t>
+                      <w:t xml:space="preserve"> </w:t>
                     </w:r>
-                  </w:p>
-                  <w:p>
-                    <w:pPr>
-                      <w:jc w:val="center"/>
-                      <w:rPr>
-                        <w:rFonts w:ascii="Helvetica Neue W23 for SKY Reg" w:hAnsi="Helvetica Neue W23 for SKY Reg"/>
-                        <w:color w:val="FFFFFF" w:themeColor="background1"/>
-                      </w:rPr>
-                    </w:pPr>
                     <w:r>
                       <w:rPr>
-                        <w:rFonts w:ascii="Helvetica Neue W23 for SKY Reg" w:hAnsi="Helvetica Neue W23 for SKY Reg"/>
+                        <w:rFonts w:ascii="Helvetica Neue W23 for SKY Reg" w:hAnsi="Helvetica Neue W23 for SKY Reg" w:hint="cs"/>
+                        <w:b/>
+                        <w:bCs/>
                         <w:color w:val="FFFFFF" w:themeColor="background1"/>
+                        <w:sz w:val="24"/>
+                        <w:szCs w:val="28"/>
                         <w:rtl/>
                       </w:rPr>
-                      <w:t>{{signatureLeftName}}</w:t>
+                      <w:t xml:space="preserve">1448 هـ </w:t>
                     </w:r>
                   </w:p>
                 </w:txbxContent>
               </v:textbox>
-              <w10:wrap type="tight"/>
-            </v:shape>
-          </w:pict>
-        </mc:Fallback>
-      </mc:AlternateContent>
-    </w:r>
-    <w:r>
-      <w:rPr>
-        <w:noProof/>
-        <w:rtl/>
-      </w:rPr>
-      <mc:AlternateContent>
-        <mc:Choice Requires="wps">
-          <w:drawing>
-            <wp:anchor distT="45720" distB="45720" distL="114300" distR="114300" simplePos="0" relativeHeight="251660288" behindDoc="1" locked="0" layoutInCell="1" allowOverlap="1" wp14:anchorId="10648FAF" wp14:editId="31112C68">
-              <wp:simplePos x="0" y="0"/>
-              <wp:positionH relativeFrom="margin">
-                <wp:posOffset>4703445</wp:posOffset>
-              </wp:positionH>
-              <wp:positionV relativeFrom="paragraph">
-                <wp:posOffset>241935</wp:posOffset>
-              </wp:positionV>
-              <wp:extent cx="2360930" cy="499110"/>
-              <wp:effectExtent l="0" t="0" r="0" b="0"/>
-              <wp:wrapTight wrapText="bothSides">
-                <wp:wrapPolygon edited="0">
-                  <wp:start x="536" y="0"/>
-                  <wp:lineTo x="536" y="20611"/>
-                  <wp:lineTo x="20897" y="20611"/>
-                  <wp:lineTo x="20897" y="0"/>
-                  <wp:lineTo x="536" y="0"/>
-                </wp:wrapPolygon>
-              </wp:wrapTight>
-              <wp:docPr id="166451498" name="مربع نص 2"/>
-              <wp:cNvGraphicFramePr>
-                <a:graphicFrameLocks xmlns:a="http://schemas.openxmlformats.org/drawingml/2006/main"/>
-              </wp:cNvGraphicFramePr>
-              <a:graphic xmlns:a="http://schemas.openxmlformats.org/drawingml/2006/main">
-                <a:graphicData uri="http://schemas.microsoft.com/office/word/2010/wordprocessingShape">
-                  <wps:wsp>
-                    <wps:cNvSpPr txBox="1">
-                      <a:spLocks noChangeArrowheads="1"/>
-                    </wps:cNvSpPr>
-                    <wps:spPr bwMode="auto">
-                      <a:xfrm flipH="1">
-                        <a:off x="0" y="0"/>
-                        <a:ext cx="2360930" cy="499110"/>
-                      </a:xfrm>
-                      <a:prstGeom prst="rect">
-                        <a:avLst/>
-                      </a:prstGeom>
-                      <a:noFill/>
-                      <a:ln w="9525">
-                        <a:noFill/>
-                        <a:miter lim="800000"/>
-                        <a:headEnd/>
-                        <a:tailEnd/>
-                      </a:ln>
-                    </wps:spPr>
-                    <wps:txbx>
-                      <w:txbxContent>
-                        <w:p>
-                          <w:pPr>
-                            <w:jc w:val="center"/>
-                            <w:rPr>
-                              <w:rFonts w:ascii="Helvetica Neue W23 for SKY Reg" w:hAnsi="Helvetica Neue W23 for SKY Reg"/>
-                              <w:color w:val="FFFFFF" w:themeColor="background1"/>
-                            </w:rPr>
-                          </w:pPr>
-                          <w:r>
-                            <w:rPr>
-                              <w:rFonts w:ascii="Helvetica Neue W23 for SKY Reg" w:hAnsi="Helvetica Neue W23 for SKY Reg"/>
-                              <w:color w:val="FFFFFF" w:themeColor="background1"/>
-                              <w:rtl/>
-                            </w:rPr>
-                            <w:t>{{signatureRightRole}}</w:t>
-                          </w:r>
-                        </w:p>
-                        <w:p>
-                          <w:pPr>
-                            <w:jc w:val="center"/>
-                            <w:rPr>
-                              <w:rFonts w:ascii="Helvetica Neue W23 for SKY Reg" w:hAnsi="Helvetica Neue W23 for SKY Reg"/>
-                              <w:color w:val="FFFFFF" w:themeColor="background1"/>
-                            </w:rPr>
-                          </w:pPr>
-                          <w:r>
-                            <w:rPr>
-                              <w:rFonts w:ascii="Helvetica Neue W23 for SKY Reg" w:hAnsi="Helvetica Neue W23 for SKY Reg"/>
-                              <w:color w:val="FFFFFF" w:themeColor="background1"/>
-                              <w:rtl/>
-                            </w:rPr>
-                            <w:t>{{signatureRightName}}</w:t>
-                          </w:r>
-                        </w:p>
-                      </w:txbxContent>
-                    </wps:txbx>
-                    <wps:bodyPr rot="0" vert="horz" wrap="square" lIns="91440" tIns="45720" rIns="91440" bIns="45720" anchor="t" anchorCtr="0">
-                      <a:noAutofit/>
-                    </wps:bodyPr>
-                  </wps:wsp>
-                </a:graphicData>
-              </a:graphic>
-              <wp14:sizeRelH relativeFrom="margin">
-                <wp14:pctWidth>40000</wp14:pctWidth>
-              </wp14:sizeRelH>
-              <wp14:sizeRelV relativeFrom="margin">
-                <wp14:pctHeight>0</wp14:pctHeight>
-              </wp14:sizeRelV>
-            </wp:anchor>
-          </w:drawing>
-        </mc:Choice>
-        <mc:Fallback>
-          <w:pict>
-            <v:shape w14:anchorId="10648FAF" id="_x0000_s1030" type="#_x0000_t202" style="position:absolute;left:0;text-align:left;margin-left:370.35pt;margin-top:19.05pt;width:185.9pt;height:39.3pt;flip:x;z-index:-251656192;visibility:visible;mso-wrap-style:square;mso-width-percent:400;mso-height-percent:0;mso-wrap-distance-left:9pt;mso-wrap-distance-top:3.6pt;mso-wrap-distance-right:9pt;mso-wrap-distance-bottom:3.6pt;mso-position-horizontal:absolute;mso-position-horizontal-relative:margin;mso-position-vertical:absolute;mso-position-vertical-relative:text;mso-width-percent:400;mso-height-percent:0;mso-width-relative:margin;mso-height-relative:margin;v-text-anchor:top" o:gfxdata="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" filled="f" stroked="f">
-              <v:textbox>
-                <w:txbxContent>
-                  <w:p>
-                    <w:pPr>
-                      <w:jc w:val="center"/>
-                      <w:rPr>
-                        <w:rFonts w:ascii="Helvetica Neue W23 for SKY Reg" w:hAnsi="Helvetica Neue W23 for SKY Reg"/>
-                        <w:color w:val="FFFFFF" w:themeColor="background1"/>
-                      </w:rPr>
-                    </w:pPr>
-                    <w:r>
-                      <w:rPr>
-                        <w:rFonts w:ascii="Helvetica Neue W23 for SKY Reg" w:hAnsi="Helvetica Neue W23 for SKY Reg"/>
-                        <w:color w:val="FFFFFF" w:themeColor="background1"/>
-                        <w:rtl/>
-                      </w:rPr>
-                      <w:t>{{signatureRightRole}}</w:t>
-                    </w:r>
-                  </w:p>
-                  <w:p>
-                    <w:pPr>
-                      <w:jc w:val="center"/>
-                      <w:rPr>
-                        <w:rFonts w:ascii="Helvetica Neue W23 for SKY Reg" w:hAnsi="Helvetica Neue W23 for SKY Reg"/>
-                        <w:color w:val="FFFFFF" w:themeColor="background1"/>
-                      </w:rPr>
-                    </w:pPr>
-                    <w:r>
-                      <w:rPr>
-                        <w:rFonts w:ascii="Helvetica Neue W23 for SKY Reg" w:hAnsi="Helvetica Neue W23 for SKY Reg"/>
-                        <w:color w:val="FFFFFF" w:themeColor="background1"/>
-                        <w:rtl/>
-                      </w:rPr>
-                      <w:t>{{signatureRightName}}</w:t>
-                    </w:r>
-                  </w:p>
-                </w:txbxContent>
-              </v:textbox>
-              <w10:wrap type="tight" anchorx="margin"/>
+              <w10:wrap type="square" anchorx="margin"/>
             </v:shape>
           </w:pict>
         </mc:Fallback>
@@ -2574,6 +2717,7 @@
                             </w:rPr>
                             <w:t>{{</w:t>
                           </w:r>
+                          <w:proofErr w:type="spellStart"/>
                           <w:r>
                             <w:rPr>
                               <w:rFonts w:ascii="IBM Plex Sans Arabic SemiBold" w:hAnsi="IBM Plex Sans Arabic SemiBold" w:cs="IBM Plex Sans Arabic SemiBold"/>
@@ -2585,6 +2729,7 @@
                             </w:rPr>
                             <w:t>educationDepartmentName</w:t>
                           </w:r>
+                          <w:proofErr w:type="spellEnd"/>
                           <w:r>
                             <w:rPr>
                               <w:rFonts w:ascii="IBM Plex Sans Arabic SemiBold" w:hAnsi="IBM Plex Sans Arabic SemiBold" w:cs="IBM Plex Sans Arabic SemiBold"/>
@@ -2634,7 +2779,7 @@
               <v:stroke joinstyle="miter"/>
               <v:path gradientshapeok="t" o:connecttype="rect"/>
             </v:shapetype>
-            <v:shape id="مربع نص 1722858123" o:spid="_x0000_s1026" type="#_x0000_t202" style="position:absolute;margin-left:0;margin-top:.35pt;width:262.25pt;height:66pt;flip:x;z-index:251656192;visibility:visible;mso-wrap-style:square;mso-width-percent:0;mso-height-percent:0;mso-wrap-distance-left:9pt;mso-wrap-distance-top:3.6pt;mso-wrap-distance-right:9pt;mso-wrap-distance-bottom:3.6pt;mso-position-horizontal:left;mso-position-horizontal-relative:margin;mso-position-vertical:absolute;mso-position-vertical-relative:text;mso-width-percent:0;mso-height-percent:0;mso-width-relative:margin;mso-height-relative:margin;v-text-anchor:middle" o:gfxdata="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" filled="f" stroked="f">
+            <v:shape id="مربع نص 1722858123" o:spid="_x0000_s1028" type="#_x0000_t202" style="position:absolute;margin-left:0;margin-top:.35pt;width:262.25pt;height:66pt;flip:x;z-index:251656192;visibility:visible;mso-wrap-style:square;mso-width-percent:0;mso-height-percent:0;mso-wrap-distance-left:9pt;mso-wrap-distance-top:3.6pt;mso-wrap-distance-right:9pt;mso-wrap-distance-bottom:3.6pt;mso-position-horizontal:left;mso-position-horizontal-relative:margin;mso-position-vertical:absolute;mso-position-vertical-relative:text;mso-width-percent:0;mso-height-percent:0;mso-width-relative:margin;mso-height-relative:margin;v-text-anchor:middle" o:gfxdata="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" filled="f" stroked="f">
               <v:textbox inset="4pt,2pt,4pt,2pt">
                 <w:txbxContent>
                   <w:p>
@@ -2711,6 +2856,7 @@
                       </w:rPr>
                       <w:t>{{</w:t>
                     </w:r>
+                    <w:proofErr w:type="spellStart"/>
                     <w:r>
                       <w:rPr>
                         <w:rFonts w:ascii="IBM Plex Sans Arabic SemiBold" w:hAnsi="IBM Plex Sans Arabic SemiBold" w:cs="IBM Plex Sans Arabic SemiBold"/>
@@ -2722,6 +2868,7 @@
                       </w:rPr>
                       <w:t>educationDepartmentName</w:t>
                     </w:r>
+                    <w:proofErr w:type="spellEnd"/>
                     <w:r>
                       <w:rPr>
                         <w:rFonts w:ascii="IBM Plex Sans Arabic SemiBold" w:hAnsi="IBM Plex Sans Arabic SemiBold" w:cs="IBM Plex Sans Arabic SemiBold"/>
@@ -2956,7 +3103,7 @@
         </mc:Choice>
         <mc:Fallback>
           <w:pict>
-            <v:shape w14:anchorId="6CCA5EC2" id="مربع نص 1958827686" o:spid="_x0000_s1027" type="#_x0000_t202" style="position:absolute;left:0;text-align:left;margin-left:0;margin-top:38pt;width:193.4pt;height:36pt;flip:x;z-index:251655168;visibility:visible;mso-wrap-style:square;mso-width-percent:0;mso-height-percent:0;mso-wrap-distance-left:9pt;mso-wrap-distance-top:3.6pt;mso-wrap-distance-right:9pt;mso-wrap-distance-bottom:3.6pt;mso-position-horizontal:center;mso-position-horizontal-relative:margin;mso-position-vertical:absolute;mso-position-vertical-relative:text;mso-width-percent:0;mso-height-percent:0;mso-width-relative:margin;mso-height-relative:margin;v-text-anchor:top" o:gfxdata="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" filled="f" stroked="f">
+            <v:shape w14:anchorId="6CCA5EC2" id="مربع نص 1958827686" o:spid="_x0000_s1029" type="#_x0000_t202" style="position:absolute;left:0;text-align:left;margin-left:0;margin-top:38pt;width:193.4pt;height:36pt;flip:x;z-index:251655168;visibility:visible;mso-wrap-style:square;mso-width-percent:0;mso-height-percent:0;mso-wrap-distance-left:9pt;mso-wrap-distance-top:3.6pt;mso-wrap-distance-right:9pt;mso-wrap-distance-bottom:3.6pt;mso-position-horizontal:center;mso-position-horizontal-relative:margin;mso-position-vertical:absolute;mso-position-vertical-relative:text;mso-width-percent:0;mso-height-percent:0;mso-width-relative:margin;mso-height-relative:margin;v-text-anchor:top" o:gfxdata="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" filled="f" stroked="f">
               <v:textbox>
                 <w:txbxContent>
                   <w:p>

</xml_diff>

<commit_message>
Fix local registration and report signatures
</commit_message>
<xml_diff>
--- a/assets/report-templates/manager-reports/academic-achievement-committee.docx
+++ b/assets/report-templates/manager-reports/academic-achievement-committee.docx
@@ -2009,7 +2009,9 @@
                                 <w:bCs/>
                                 <w:sz w:val="24"/>
                               </w:rPr>
-                              <w:t>}} {{</w:t>
+                              <w:t>}}</w:t>
+                              <w:br/>
+                              <w:t>{{</w:t>
                             </w:r>
                             <w:proofErr w:type="spellStart"/>
                             <w:r>
@@ -2028,7 +2030,7 @@
                                 <w:bCs/>
                                 <w:sz w:val="24"/>
                               </w:rPr>
-                              <w:t>'</w:t>
+                              <w:t/>
                             </w:r>
                             <w:r>
                               <w:rPr>
@@ -2109,7 +2111,9 @@
                           <w:bCs/>
                           <w:sz w:val="24"/>
                         </w:rPr>
-                        <w:t>}} {{</w:t>
+                        <w:t>}}</w:t>
+                        <w:br/>
+                        <w:t>{{</w:t>
                       </w:r>
                       <w:proofErr w:type="spellStart"/>
                       <w:r>
@@ -2128,7 +2132,7 @@
                           <w:bCs/>
                           <w:sz w:val="24"/>
                         </w:rPr>
-                        <w:t>'</w:t>
+                        <w:t/>
                       </w:r>
                       <w:r>
                         <w:rPr>

</xml_diff>